<commit_message>
Add draft contribution entries for the other 5 team members
Marked clearly as [DRAFT, needs confirmation] so each member reviews
and rewrites their own Appendix A entry / CONTRIBUTORS.md role before
final submission.

Co-Authored-By: Claude Sonnet 5 <noreply@anthropic.com>
</commit_message>
<xml_diff>
--- a/report/NexSkill_Final_Report.docx
+++ b/report/NexSkill_Final_Report.docx
@@ -94,7 +94,7 @@
           <w:sz w:val="22"/>
           <w:szCs w:val="22"/>
         </w:rPr>
-        <w:t>[Degree Programme — e.g. BSc (Hons) Information Technology]</w:t>
+        <w:t>A common module across multiple BSc (Hons) IT specialisations — see individual degree programmes below.</w:t>
       </w:r>
     </w:p>
     <w:p>
@@ -122,7 +122,7 @@
           <w:sz w:val="22"/>
           <w:szCs w:val="22"/>
         </w:rPr>
-        <w:t>Group Leader: Shakkya Sanketh — CIT-24-01-0573</w:t>
+        <w:t>Group Leader: Shakkya Sanketh — CIT-24-01-0573 — BSc (Hons) Cybersecurity</w:t>
       </w:r>
     </w:p>
     <w:p>
@@ -134,7 +134,7 @@
           <w:sz w:val="22"/>
           <w:szCs w:val="22"/>
         </w:rPr>
-        <w:t>Malitha Gayashan — CIT-24-01-0562</w:t>
+        <w:t>Malitha Gayashan — CIT-24-01-0562 — BSc (Hons) Cybersecurity</w:t>
       </w:r>
     </w:p>
     <w:p>
@@ -146,7 +146,7 @@
           <w:sz w:val="22"/>
           <w:szCs w:val="22"/>
         </w:rPr>
-        <w:t>Nishen Madava — CIT-24-01-0256</w:t>
+        <w:t>Nishen Madava — CIT-24-01-0256 — BSc (Hons) Cybersecurity</w:t>
       </w:r>
     </w:p>
     <w:p>
@@ -158,7 +158,7 @@
           <w:sz w:val="22"/>
           <w:szCs w:val="22"/>
         </w:rPr>
-        <w:t>Chamika Janith — CIT-24-01-0182</w:t>
+        <w:t>Chamika Janith — CIT-24-01-0182 — BSc (Hons) Software Engineering</w:t>
       </w:r>
     </w:p>
     <w:p>
@@ -170,7 +170,7 @@
           <w:sz w:val="22"/>
           <w:szCs w:val="22"/>
         </w:rPr>
-        <w:t>Tharusha Pieris — CIT-24-01-0486</w:t>
+        <w:t>Tharusha Pieris — CIT-24-01-0486 — BSc (Hons) Cybersecurity</w:t>
       </w:r>
     </w:p>
     <w:p>
@@ -183,7 +183,7 @@
           <w:sz w:val="22"/>
           <w:szCs w:val="22"/>
         </w:rPr>
-        <w:t>Chamoda Dulhari — CIT-24-01-0598</w:t>
+        <w:t>Chamoda Dulhari — CIT-24-01-0598 — BSc (Hons) Data Science</w:t>
       </w:r>
     </w:p>
     <w:p>
@@ -235,10 +235,7 @@
         <w:jc w:val="both"/>
       </w:pPr>
       <w:r>
-        <w:t>We hereby declare that this report, titled “NexSkill — Intelligent Skill-Based Opportunity Matching Platform,” is our own work, carried out in fulfilment of the requirements of the CCS2360 Technology Challenges and Competitions module at SLTC Research University. All work presented — the system design, the implementation, the experiments in Chapter 8, and the writing of this report — was carried out by the group named on the title page, under the supervision of the module coordinator. All sources of informa</w:t>
-      </w:r>
-      <w:r>
-        <w:t>tion used in preparing this report have been acknowledged by means of complete references, listed in the References chapter. This report has not been submitted, in whole or in part, for any other academic qualification.</w:t>
+        <w:t>We hereby declare that this report, titled “NexSkill — Intelligent Skill-Based Opportunity Matching Platform,” is our own work, carried out in fulfilment of the requirements of the CCS2360 Technology Challenges and Competitions module at SLTC Research University. All work presented — the system design, the implementation, the experiments in Chapter 8, and the writing of this report — was carried out by the group named on the title page, under the supervision of the module coordinator. All sources of information used in preparing this report have been acknowledged by means of complete references, listed in the References chapter. This report has not been submitted, in whole or in part, for any other academic qualification.</w:t>
       </w:r>
     </w:p>
     <w:p>
@@ -368,10 +365,7 @@
         <w:jc w:val="both"/>
       </w:pPr>
       <w:r>
-        <w:t>Each student-posting pair is scored out of 100 using five weighted factors — skill overlap (45%), GPA alignment (20%), preference match (15%), year-of-study fit (10%), and certification relevance (10%). Skill overlap itself is computed in three tiers: exact string matches, a curated table of semantically equivalent skills (e.g. Node.js ≈ Express.js), and, novel to this implementation, a TF-IDF cosine-similarity layer computed over a 70-skill descriptive-tag corpus that recovers partial credit for related sk</w:t>
-      </w:r>
-      <w:r>
-        <w:t>ills neither tier above catches (e.g. Vue against a React requirement, or Docker against Kubernetes). The full breakdown, not just the final score, is shown to both students and recruiters, so every ranking is explainable.</w:t>
+        <w:t>Each student-posting pair is scored out of 100 using five weighted factors — skill overlap (45%), GPA alignment (20%), preference match (15%), year-of-study fit (10%), and certification relevance (10%). Skill overlap itself is computed in three tiers: exact string matches, a curated table of semantically equivalent skills (e.g. Node.js ≈ Express.js), and, novel to this implementation, a TF-IDF cosine-similarity layer computed over a 70-skill descriptive-tag corpus that recovers partial credit for related skills neither tier above catches (e.g. Vue against a React requirement, or Docker against Kubernetes). The full breakdown, not just the final score, is shown to both students and recruiters, so every ranking is explainable.</w:t>
       </w:r>
     </w:p>
     <w:p>
@@ -389,10 +383,7 @@
         <w:jc w:val="both"/>
       </w:pPr>
       <w:r>
-        <w:t>An algorithm-optimisation experiment was run against ten seeded student profiles and four postings (40 pairs), using an algorithm-independent ground truth. The baseline weighting achieved 90% precision and 90% recall against this ground truth; per-factor correlation analysis showed skill overlap (r = 0.91) and preference match (r = 0.85) as strong predictors and GPA (r = −0.01) as statistically uninformative for this dataset, informing a documented second weighting iteration. The report concludes that a tra</w:t>
-      </w:r>
-      <w:r>
-        <w:t>nsparent, rule-plus-statistics matching approach is a defensible, explainable alternative to an opaque machine-learning model for a system whose primary audience — students being told why they were or were not matched — needs to trust and act on the explanation, not just the score.</w:t>
+        <w:t>An algorithm-optimisation experiment was run against ten seeded student profiles and four postings (40 pairs), using an algorithm-independent ground truth. The baseline weighting achieved 90% precision and 90% recall against this ground truth; per-factor correlation analysis showed skill overlap (r = 0.91) and preference match (r = 0.85) as strong predictors and GPA (r = −0.01) as statistically uninformative for this dataset, informing a documented second weighting iteration. The report concludes that a transparent, rule-plus-statistics matching approach is a defensible, explainable alternative to an opaque machine-learning model for a system whose primary audience — students being told why they were or were not matched — needs to trust and act on the explanation, not just the score.</w:t>
       </w:r>
     </w:p>
     <w:p>
@@ -430,11 +421,7 @@
           </w:pPr>
           <w:r>
             <w:fldChar w:fldCharType="begin"/>
-          </w:r>
-          <w:r>
             <w:instrText>TOC \h \o "1-3"</w:instrText>
-          </w:r>
-          <w:r>
             <w:fldChar w:fldCharType="separate"/>
           </w:r>
           <w:hyperlink w:anchor="_Toc241730480" w:history="1">
@@ -452,40 +439,10 @@
                 <w:noProof/>
               </w:rPr>
               <w:tab/>
-            </w:r>
-            <w:r>
-              <w:rPr>
-                <w:noProof/>
-              </w:rPr>
               <w:fldChar w:fldCharType="begin"/>
-            </w:r>
-            <w:r>
-              <w:rPr>
-                <w:noProof/>
-              </w:rPr>
               <w:instrText xml:space="preserve"> PAGEREF _Toc241730480 \h </w:instrText>
-            </w:r>
-            <w:r>
-              <w:rPr>
-                <w:noProof/>
-              </w:rPr>
-            </w:r>
-            <w:r>
-              <w:rPr>
-                <w:noProof/>
-              </w:rPr>
               <w:fldChar w:fldCharType="separate"/>
-            </w:r>
-            <w:r>
-              <w:rPr>
-                <w:noProof/>
-              </w:rPr>
               <w:t>1</w:t>
-            </w:r>
-            <w:r>
-              <w:rPr>
-                <w:noProof/>
-              </w:rPr>
               <w:fldChar w:fldCharType="end"/>
             </w:r>
           </w:hyperlink>
@@ -515,40 +472,10 @@
                 <w:noProof/>
               </w:rPr>
               <w:tab/>
-            </w:r>
-            <w:r>
-              <w:rPr>
-                <w:noProof/>
-              </w:rPr>
               <w:fldChar w:fldCharType="begin"/>
-            </w:r>
-            <w:r>
-              <w:rPr>
-                <w:noProof/>
-              </w:rPr>
               <w:instrText xml:space="preserve"> PAGEREF _Toc241730481 \h </w:instrText>
-            </w:r>
-            <w:r>
-              <w:rPr>
-                <w:noProof/>
-              </w:rPr>
-            </w:r>
-            <w:r>
-              <w:rPr>
-                <w:noProof/>
-              </w:rPr>
               <w:fldChar w:fldCharType="separate"/>
-            </w:r>
-            <w:r>
-              <w:rPr>
-                <w:noProof/>
-              </w:rPr>
               <w:t>1</w:t>
-            </w:r>
-            <w:r>
-              <w:rPr>
-                <w:noProof/>
-              </w:rPr>
               <w:fldChar w:fldCharType="end"/>
             </w:r>
           </w:hyperlink>
@@ -578,40 +505,10 @@
                 <w:noProof/>
               </w:rPr>
               <w:tab/>
-            </w:r>
-            <w:r>
-              <w:rPr>
-                <w:noProof/>
-              </w:rPr>
               <w:fldChar w:fldCharType="begin"/>
-            </w:r>
-            <w:r>
-              <w:rPr>
-                <w:noProof/>
-              </w:rPr>
               <w:instrText xml:space="preserve"> PAGEREF _Toc241730482 \h </w:instrText>
-            </w:r>
-            <w:r>
-              <w:rPr>
-                <w:noProof/>
-              </w:rPr>
-            </w:r>
-            <w:r>
-              <w:rPr>
-                <w:noProof/>
-              </w:rPr>
               <w:fldChar w:fldCharType="separate"/>
-            </w:r>
-            <w:r>
-              <w:rPr>
-                <w:noProof/>
-              </w:rPr>
               <w:t>1</w:t>
-            </w:r>
-            <w:r>
-              <w:rPr>
-                <w:noProof/>
-              </w:rPr>
               <w:fldChar w:fldCharType="end"/>
             </w:r>
           </w:hyperlink>
@@ -641,40 +538,10 @@
                 <w:noProof/>
               </w:rPr>
               <w:tab/>
-            </w:r>
-            <w:r>
-              <w:rPr>
-                <w:noProof/>
-              </w:rPr>
               <w:fldChar w:fldCharType="begin"/>
-            </w:r>
-            <w:r>
-              <w:rPr>
-                <w:noProof/>
-              </w:rPr>
               <w:instrText xml:space="preserve"> PAGEREF _Toc241730483 \h </w:instrText>
-            </w:r>
-            <w:r>
-              <w:rPr>
-                <w:noProof/>
-              </w:rPr>
-            </w:r>
-            <w:r>
-              <w:rPr>
-                <w:noProof/>
-              </w:rPr>
               <w:fldChar w:fldCharType="separate"/>
-            </w:r>
-            <w:r>
-              <w:rPr>
-                <w:noProof/>
-              </w:rPr>
               <w:t>1</w:t>
-            </w:r>
-            <w:r>
-              <w:rPr>
-                <w:noProof/>
-              </w:rPr>
               <w:fldChar w:fldCharType="end"/>
             </w:r>
           </w:hyperlink>
@@ -704,40 +571,10 @@
                 <w:noProof/>
               </w:rPr>
               <w:tab/>
-            </w:r>
-            <w:r>
-              <w:rPr>
-                <w:noProof/>
-              </w:rPr>
               <w:fldChar w:fldCharType="begin"/>
-            </w:r>
-            <w:r>
-              <w:rPr>
-                <w:noProof/>
-              </w:rPr>
               <w:instrText xml:space="preserve"> PAGEREF _Toc241730484 \h </w:instrText>
-            </w:r>
-            <w:r>
-              <w:rPr>
-                <w:noProof/>
-              </w:rPr>
-            </w:r>
-            <w:r>
-              <w:rPr>
-                <w:noProof/>
-              </w:rPr>
               <w:fldChar w:fldCharType="separate"/>
-            </w:r>
-            <w:r>
-              <w:rPr>
-                <w:noProof/>
-              </w:rPr>
               <w:t>2</w:t>
-            </w:r>
-            <w:r>
-              <w:rPr>
-                <w:noProof/>
-              </w:rPr>
               <w:fldChar w:fldCharType="end"/>
             </w:r>
           </w:hyperlink>
@@ -767,40 +604,10 @@
                 <w:noProof/>
               </w:rPr>
               <w:tab/>
-            </w:r>
-            <w:r>
-              <w:rPr>
-                <w:noProof/>
-              </w:rPr>
               <w:fldChar w:fldCharType="begin"/>
-            </w:r>
-            <w:r>
-              <w:rPr>
-                <w:noProof/>
-              </w:rPr>
               <w:instrText xml:space="preserve"> PAGEREF _Toc241730485 \h </w:instrText>
-            </w:r>
-            <w:r>
-              <w:rPr>
-                <w:noProof/>
-              </w:rPr>
-            </w:r>
-            <w:r>
-              <w:rPr>
-                <w:noProof/>
-              </w:rPr>
               <w:fldChar w:fldCharType="separate"/>
-            </w:r>
-            <w:r>
-              <w:rPr>
-                <w:noProof/>
-              </w:rPr>
               <w:t>2</w:t>
-            </w:r>
-            <w:r>
-              <w:rPr>
-                <w:noProof/>
-              </w:rPr>
               <w:fldChar w:fldCharType="end"/>
             </w:r>
           </w:hyperlink>
@@ -830,40 +637,10 @@
                 <w:noProof/>
               </w:rPr>
               <w:tab/>
-            </w:r>
-            <w:r>
-              <w:rPr>
-                <w:noProof/>
-              </w:rPr>
               <w:fldChar w:fldCharType="begin"/>
-            </w:r>
-            <w:r>
-              <w:rPr>
-                <w:noProof/>
-              </w:rPr>
               <w:instrText xml:space="preserve"> PAGEREF _Toc241730486 \h </w:instrText>
-            </w:r>
-            <w:r>
-              <w:rPr>
-                <w:noProof/>
-              </w:rPr>
-            </w:r>
-            <w:r>
-              <w:rPr>
-                <w:noProof/>
-              </w:rPr>
               <w:fldChar w:fldCharType="separate"/>
-            </w:r>
-            <w:r>
-              <w:rPr>
-                <w:noProof/>
-              </w:rPr>
               <w:t>3</w:t>
-            </w:r>
-            <w:r>
-              <w:rPr>
-                <w:noProof/>
-              </w:rPr>
               <w:fldChar w:fldCharType="end"/>
             </w:r>
           </w:hyperlink>
@@ -893,40 +670,10 @@
                 <w:noProof/>
               </w:rPr>
               <w:tab/>
-            </w:r>
-            <w:r>
-              <w:rPr>
-                <w:noProof/>
-              </w:rPr>
               <w:fldChar w:fldCharType="begin"/>
-            </w:r>
-            <w:r>
-              <w:rPr>
-                <w:noProof/>
-              </w:rPr>
               <w:instrText xml:space="preserve"> PAGEREF _Toc241730487 \h </w:instrText>
-            </w:r>
-            <w:r>
-              <w:rPr>
-                <w:noProof/>
-              </w:rPr>
-            </w:r>
-            <w:r>
-              <w:rPr>
-                <w:noProof/>
-              </w:rPr>
               <w:fldChar w:fldCharType="separate"/>
-            </w:r>
-            <w:r>
-              <w:rPr>
-                <w:noProof/>
-              </w:rPr>
               <w:t>4</w:t>
-            </w:r>
-            <w:r>
-              <w:rPr>
-                <w:noProof/>
-              </w:rPr>
               <w:fldChar w:fldCharType="end"/>
             </w:r>
           </w:hyperlink>
@@ -956,40 +703,10 @@
                 <w:noProof/>
               </w:rPr>
               <w:tab/>
-            </w:r>
-            <w:r>
-              <w:rPr>
-                <w:noProof/>
-              </w:rPr>
               <w:fldChar w:fldCharType="begin"/>
-            </w:r>
-            <w:r>
-              <w:rPr>
-                <w:noProof/>
-              </w:rPr>
               <w:instrText xml:space="preserve"> PAGEREF _Toc241730488 \h </w:instrText>
-            </w:r>
-            <w:r>
-              <w:rPr>
-                <w:noProof/>
-              </w:rPr>
-            </w:r>
-            <w:r>
-              <w:rPr>
-                <w:noProof/>
-              </w:rPr>
               <w:fldChar w:fldCharType="separate"/>
-            </w:r>
-            <w:r>
-              <w:rPr>
-                <w:noProof/>
-              </w:rPr>
               <w:t>4</w:t>
-            </w:r>
-            <w:r>
-              <w:rPr>
-                <w:noProof/>
-              </w:rPr>
               <w:fldChar w:fldCharType="end"/>
             </w:r>
           </w:hyperlink>
@@ -1019,40 +736,10 @@
                 <w:noProof/>
               </w:rPr>
               <w:tab/>
-            </w:r>
-            <w:r>
-              <w:rPr>
-                <w:noProof/>
-              </w:rPr>
               <w:fldChar w:fldCharType="begin"/>
-            </w:r>
-            <w:r>
-              <w:rPr>
-                <w:noProof/>
-              </w:rPr>
               <w:instrText xml:space="preserve"> PAGEREF _Toc241730489 \h </w:instrText>
-            </w:r>
-            <w:r>
-              <w:rPr>
-                <w:noProof/>
-              </w:rPr>
-            </w:r>
-            <w:r>
-              <w:rPr>
-                <w:noProof/>
-              </w:rPr>
               <w:fldChar w:fldCharType="separate"/>
-            </w:r>
-            <w:r>
-              <w:rPr>
-                <w:noProof/>
-              </w:rPr>
               <w:t>4</w:t>
-            </w:r>
-            <w:r>
-              <w:rPr>
-                <w:noProof/>
-              </w:rPr>
               <w:fldChar w:fldCharType="end"/>
             </w:r>
           </w:hyperlink>
@@ -1082,40 +769,10 @@
                 <w:noProof/>
               </w:rPr>
               <w:tab/>
-            </w:r>
-            <w:r>
-              <w:rPr>
-                <w:noProof/>
-              </w:rPr>
               <w:fldChar w:fldCharType="begin"/>
-            </w:r>
-            <w:r>
-              <w:rPr>
-                <w:noProof/>
-              </w:rPr>
               <w:instrText xml:space="preserve"> PAGEREF _Toc241730490 \h </w:instrText>
-            </w:r>
-            <w:r>
-              <w:rPr>
-                <w:noProof/>
-              </w:rPr>
-            </w:r>
-            <w:r>
-              <w:rPr>
-                <w:noProof/>
-              </w:rPr>
               <w:fldChar w:fldCharType="separate"/>
-            </w:r>
-            <w:r>
-              <w:rPr>
-                <w:noProof/>
-              </w:rPr>
               <w:t>5</w:t>
-            </w:r>
-            <w:r>
-              <w:rPr>
-                <w:noProof/>
-              </w:rPr>
               <w:fldChar w:fldCharType="end"/>
             </w:r>
           </w:hyperlink>
@@ -1145,40 +802,10 @@
                 <w:noProof/>
               </w:rPr>
               <w:tab/>
-            </w:r>
-            <w:r>
-              <w:rPr>
-                <w:noProof/>
-              </w:rPr>
               <w:fldChar w:fldCharType="begin"/>
-            </w:r>
-            <w:r>
-              <w:rPr>
-                <w:noProof/>
-              </w:rPr>
               <w:instrText xml:space="preserve"> PAGEREF _Toc241730491 \h </w:instrText>
-            </w:r>
-            <w:r>
-              <w:rPr>
-                <w:noProof/>
-              </w:rPr>
-            </w:r>
-            <w:r>
-              <w:rPr>
-                <w:noProof/>
-              </w:rPr>
               <w:fldChar w:fldCharType="separate"/>
-            </w:r>
-            <w:r>
-              <w:rPr>
-                <w:noProof/>
-              </w:rPr>
               <w:t>5</w:t>
-            </w:r>
-            <w:r>
-              <w:rPr>
-                <w:noProof/>
-              </w:rPr>
               <w:fldChar w:fldCharType="end"/>
             </w:r>
           </w:hyperlink>
@@ -1208,40 +835,10 @@
                 <w:noProof/>
               </w:rPr>
               <w:tab/>
-            </w:r>
-            <w:r>
-              <w:rPr>
-                <w:noProof/>
-              </w:rPr>
               <w:fldChar w:fldCharType="begin"/>
-            </w:r>
-            <w:r>
-              <w:rPr>
-                <w:noProof/>
-              </w:rPr>
               <w:instrText xml:space="preserve"> PAGEREF _Toc241730492 \h </w:instrText>
-            </w:r>
-            <w:r>
-              <w:rPr>
-                <w:noProof/>
-              </w:rPr>
-            </w:r>
-            <w:r>
-              <w:rPr>
-                <w:noProof/>
-              </w:rPr>
               <w:fldChar w:fldCharType="separate"/>
-            </w:r>
-            <w:r>
-              <w:rPr>
-                <w:noProof/>
-              </w:rPr>
               <w:t>6</w:t>
-            </w:r>
-            <w:r>
-              <w:rPr>
-                <w:noProof/>
-              </w:rPr>
               <w:fldChar w:fldCharType="end"/>
             </w:r>
           </w:hyperlink>
@@ -1271,40 +868,10 @@
                 <w:noProof/>
               </w:rPr>
               <w:tab/>
-            </w:r>
-            <w:r>
-              <w:rPr>
-                <w:noProof/>
-              </w:rPr>
               <w:fldChar w:fldCharType="begin"/>
-            </w:r>
-            <w:r>
-              <w:rPr>
-                <w:noProof/>
-              </w:rPr>
               <w:instrText xml:space="preserve"> PAGEREF _Toc241730493 \h </w:instrText>
-            </w:r>
-            <w:r>
-              <w:rPr>
-                <w:noProof/>
-              </w:rPr>
-            </w:r>
-            <w:r>
-              <w:rPr>
-                <w:noProof/>
-              </w:rPr>
               <w:fldChar w:fldCharType="separate"/>
-            </w:r>
-            <w:r>
-              <w:rPr>
-                <w:noProof/>
-              </w:rPr>
               <w:t>6</w:t>
-            </w:r>
-            <w:r>
-              <w:rPr>
-                <w:noProof/>
-              </w:rPr>
               <w:fldChar w:fldCharType="end"/>
             </w:r>
           </w:hyperlink>
@@ -1334,40 +901,10 @@
                 <w:noProof/>
               </w:rPr>
               <w:tab/>
-            </w:r>
-            <w:r>
-              <w:rPr>
-                <w:noProof/>
-              </w:rPr>
               <w:fldChar w:fldCharType="begin"/>
-            </w:r>
-            <w:r>
-              <w:rPr>
-                <w:noProof/>
-              </w:rPr>
               <w:instrText xml:space="preserve"> PAGEREF _Toc241730494 \h </w:instrText>
-            </w:r>
-            <w:r>
-              <w:rPr>
-                <w:noProof/>
-              </w:rPr>
-            </w:r>
-            <w:r>
-              <w:rPr>
-                <w:noProof/>
-              </w:rPr>
               <w:fldChar w:fldCharType="separate"/>
-            </w:r>
-            <w:r>
-              <w:rPr>
-                <w:noProof/>
-              </w:rPr>
               <w:t>7</w:t>
-            </w:r>
-            <w:r>
-              <w:rPr>
-                <w:noProof/>
-              </w:rPr>
               <w:fldChar w:fldCharType="end"/>
             </w:r>
           </w:hyperlink>
@@ -1397,40 +934,10 @@
                 <w:noProof/>
               </w:rPr>
               <w:tab/>
-            </w:r>
-            <w:r>
-              <w:rPr>
-                <w:noProof/>
-              </w:rPr>
               <w:fldChar w:fldCharType="begin"/>
-            </w:r>
-            <w:r>
-              <w:rPr>
-                <w:noProof/>
-              </w:rPr>
               <w:instrText xml:space="preserve"> PAGEREF _Toc241730495 \h </w:instrText>
-            </w:r>
-            <w:r>
-              <w:rPr>
-                <w:noProof/>
-              </w:rPr>
-            </w:r>
-            <w:r>
-              <w:rPr>
-                <w:noProof/>
-              </w:rPr>
               <w:fldChar w:fldCharType="separate"/>
-            </w:r>
-            <w:r>
-              <w:rPr>
-                <w:noProof/>
-              </w:rPr>
               <w:t>7</w:t>
-            </w:r>
-            <w:r>
-              <w:rPr>
-                <w:noProof/>
-              </w:rPr>
               <w:fldChar w:fldCharType="end"/>
             </w:r>
           </w:hyperlink>
@@ -1460,40 +967,10 @@
                 <w:noProof/>
               </w:rPr>
               <w:tab/>
-            </w:r>
-            <w:r>
-              <w:rPr>
-                <w:noProof/>
-              </w:rPr>
               <w:fldChar w:fldCharType="begin"/>
-            </w:r>
-            <w:r>
-              <w:rPr>
-                <w:noProof/>
-              </w:rPr>
               <w:instrText xml:space="preserve"> PAGEREF _Toc241730496 \h </w:instrText>
-            </w:r>
-            <w:r>
-              <w:rPr>
-                <w:noProof/>
-              </w:rPr>
-            </w:r>
-            <w:r>
-              <w:rPr>
-                <w:noProof/>
-              </w:rPr>
               <w:fldChar w:fldCharType="separate"/>
-            </w:r>
-            <w:r>
-              <w:rPr>
-                <w:noProof/>
-              </w:rPr>
               <w:t>7</w:t>
-            </w:r>
-            <w:r>
-              <w:rPr>
-                <w:noProof/>
-              </w:rPr>
               <w:fldChar w:fldCharType="end"/>
             </w:r>
           </w:hyperlink>
@@ -1523,40 +1000,10 @@
                 <w:noProof/>
               </w:rPr>
               <w:tab/>
-            </w:r>
-            <w:r>
-              <w:rPr>
-                <w:noProof/>
-              </w:rPr>
               <w:fldChar w:fldCharType="begin"/>
-            </w:r>
-            <w:r>
-              <w:rPr>
-                <w:noProof/>
-              </w:rPr>
               <w:instrText xml:space="preserve"> PAGEREF _Toc241730497 \h </w:instrText>
-            </w:r>
-            <w:r>
-              <w:rPr>
-                <w:noProof/>
-              </w:rPr>
-            </w:r>
-            <w:r>
-              <w:rPr>
-                <w:noProof/>
-              </w:rPr>
               <w:fldChar w:fldCharType="separate"/>
-            </w:r>
-            <w:r>
-              <w:rPr>
-                <w:noProof/>
-              </w:rPr>
               <w:t>7</w:t>
-            </w:r>
-            <w:r>
-              <w:rPr>
-                <w:noProof/>
-              </w:rPr>
               <w:fldChar w:fldCharType="end"/>
             </w:r>
           </w:hyperlink>
@@ -1586,40 +1033,10 @@
                 <w:noProof/>
               </w:rPr>
               <w:tab/>
-            </w:r>
-            <w:r>
-              <w:rPr>
-                <w:noProof/>
-              </w:rPr>
               <w:fldChar w:fldCharType="begin"/>
-            </w:r>
-            <w:r>
-              <w:rPr>
-                <w:noProof/>
-              </w:rPr>
               <w:instrText xml:space="preserve"> PAGEREF _Toc241730498 \h </w:instrText>
-            </w:r>
-            <w:r>
-              <w:rPr>
-                <w:noProof/>
-              </w:rPr>
-            </w:r>
-            <w:r>
-              <w:rPr>
-                <w:noProof/>
-              </w:rPr>
               <w:fldChar w:fldCharType="separate"/>
-            </w:r>
-            <w:r>
-              <w:rPr>
-                <w:noProof/>
-              </w:rPr>
               <w:t>8</w:t>
-            </w:r>
-            <w:r>
-              <w:rPr>
-                <w:noProof/>
-              </w:rPr>
               <w:fldChar w:fldCharType="end"/>
             </w:r>
           </w:hyperlink>
@@ -1649,40 +1066,10 @@
                 <w:noProof/>
               </w:rPr>
               <w:tab/>
-            </w:r>
-            <w:r>
-              <w:rPr>
-                <w:noProof/>
-              </w:rPr>
               <w:fldChar w:fldCharType="begin"/>
-            </w:r>
-            <w:r>
-              <w:rPr>
-                <w:noProof/>
-              </w:rPr>
               <w:instrText xml:space="preserve"> PAGEREF _Toc241730499 \h </w:instrText>
-            </w:r>
-            <w:r>
-              <w:rPr>
-                <w:noProof/>
-              </w:rPr>
-            </w:r>
-            <w:r>
-              <w:rPr>
-                <w:noProof/>
-              </w:rPr>
               <w:fldChar w:fldCharType="separate"/>
-            </w:r>
-            <w:r>
-              <w:rPr>
-                <w:noProof/>
-              </w:rPr>
               <w:t>8</w:t>
-            </w:r>
-            <w:r>
-              <w:rPr>
-                <w:noProof/>
-              </w:rPr>
               <w:fldChar w:fldCharType="end"/>
             </w:r>
           </w:hyperlink>
@@ -1712,40 +1099,10 @@
                 <w:noProof/>
               </w:rPr>
               <w:tab/>
-            </w:r>
-            <w:r>
-              <w:rPr>
-                <w:noProof/>
-              </w:rPr>
               <w:fldChar w:fldCharType="begin"/>
-            </w:r>
-            <w:r>
-              <w:rPr>
-                <w:noProof/>
-              </w:rPr>
               <w:instrText xml:space="preserve"> PAGEREF _Toc241730500 \h </w:instrText>
-            </w:r>
-            <w:r>
-              <w:rPr>
-                <w:noProof/>
-              </w:rPr>
-            </w:r>
-            <w:r>
-              <w:rPr>
-                <w:noProof/>
-              </w:rPr>
               <w:fldChar w:fldCharType="separate"/>
-            </w:r>
-            <w:r>
-              <w:rPr>
-                <w:noProof/>
-              </w:rPr>
               <w:t>9</w:t>
-            </w:r>
-            <w:r>
-              <w:rPr>
-                <w:noProof/>
-              </w:rPr>
               <w:fldChar w:fldCharType="end"/>
             </w:r>
           </w:hyperlink>
@@ -1775,40 +1132,10 @@
                 <w:noProof/>
               </w:rPr>
               <w:tab/>
-            </w:r>
-            <w:r>
-              <w:rPr>
-                <w:noProof/>
-              </w:rPr>
               <w:fldChar w:fldCharType="begin"/>
-            </w:r>
-            <w:r>
-              <w:rPr>
-                <w:noProof/>
-              </w:rPr>
               <w:instrText xml:space="preserve"> PAGEREF _Toc241730501 \h </w:instrText>
-            </w:r>
-            <w:r>
-              <w:rPr>
-                <w:noProof/>
-              </w:rPr>
-            </w:r>
-            <w:r>
-              <w:rPr>
-                <w:noProof/>
-              </w:rPr>
               <w:fldChar w:fldCharType="separate"/>
-            </w:r>
-            <w:r>
-              <w:rPr>
-                <w:noProof/>
-              </w:rPr>
               <w:t>10</w:t>
-            </w:r>
-            <w:r>
-              <w:rPr>
-                <w:noProof/>
-              </w:rPr>
               <w:fldChar w:fldCharType="end"/>
             </w:r>
           </w:hyperlink>
@@ -1838,40 +1165,10 @@
                 <w:noProof/>
               </w:rPr>
               <w:tab/>
-            </w:r>
-            <w:r>
-              <w:rPr>
-                <w:noProof/>
-              </w:rPr>
               <w:fldChar w:fldCharType="begin"/>
-            </w:r>
-            <w:r>
-              <w:rPr>
-                <w:noProof/>
-              </w:rPr>
               <w:instrText xml:space="preserve"> PAGEREF _Toc241730502 \h </w:instrText>
-            </w:r>
-            <w:r>
-              <w:rPr>
-                <w:noProof/>
-              </w:rPr>
-            </w:r>
-            <w:r>
-              <w:rPr>
-                <w:noProof/>
-              </w:rPr>
               <w:fldChar w:fldCharType="separate"/>
-            </w:r>
-            <w:r>
-              <w:rPr>
-                <w:noProof/>
-              </w:rPr>
               <w:t>10</w:t>
-            </w:r>
-            <w:r>
-              <w:rPr>
-                <w:noProof/>
-              </w:rPr>
               <w:fldChar w:fldCharType="end"/>
             </w:r>
           </w:hyperlink>
@@ -1901,40 +1198,10 @@
                 <w:noProof/>
               </w:rPr>
               <w:tab/>
-            </w:r>
-            <w:r>
-              <w:rPr>
-                <w:noProof/>
-              </w:rPr>
               <w:fldChar w:fldCharType="begin"/>
-            </w:r>
-            <w:r>
-              <w:rPr>
-                <w:noProof/>
-              </w:rPr>
               <w:instrText xml:space="preserve"> PAGEREF _Toc241730503 \h </w:instrText>
-            </w:r>
-            <w:r>
-              <w:rPr>
-                <w:noProof/>
-              </w:rPr>
-            </w:r>
-            <w:r>
-              <w:rPr>
-                <w:noProof/>
-              </w:rPr>
               <w:fldChar w:fldCharType="separate"/>
-            </w:r>
-            <w:r>
-              <w:rPr>
-                <w:noProof/>
-              </w:rPr>
               <w:t>10</w:t>
-            </w:r>
-            <w:r>
-              <w:rPr>
-                <w:noProof/>
-              </w:rPr>
               <w:fldChar w:fldCharType="end"/>
             </w:r>
           </w:hyperlink>
@@ -1964,40 +1231,10 @@
                 <w:noProof/>
               </w:rPr>
               <w:tab/>
-            </w:r>
-            <w:r>
-              <w:rPr>
-                <w:noProof/>
-              </w:rPr>
               <w:fldChar w:fldCharType="begin"/>
-            </w:r>
-            <w:r>
-              <w:rPr>
-                <w:noProof/>
-              </w:rPr>
               <w:instrText xml:space="preserve"> PAGEREF _Toc241730504 \h </w:instrText>
-            </w:r>
-            <w:r>
-              <w:rPr>
-                <w:noProof/>
-              </w:rPr>
-            </w:r>
-            <w:r>
-              <w:rPr>
-                <w:noProof/>
-              </w:rPr>
               <w:fldChar w:fldCharType="separate"/>
-            </w:r>
-            <w:r>
-              <w:rPr>
-                <w:noProof/>
-              </w:rPr>
               <w:t>10</w:t>
-            </w:r>
-            <w:r>
-              <w:rPr>
-                <w:noProof/>
-              </w:rPr>
               <w:fldChar w:fldCharType="end"/>
             </w:r>
           </w:hyperlink>
@@ -2027,40 +1264,10 @@
                 <w:noProof/>
               </w:rPr>
               <w:tab/>
-            </w:r>
-            <w:r>
-              <w:rPr>
-                <w:noProof/>
-              </w:rPr>
               <w:fldChar w:fldCharType="begin"/>
-            </w:r>
-            <w:r>
-              <w:rPr>
-                <w:noProof/>
-              </w:rPr>
               <w:instrText xml:space="preserve"> PAGEREF _Toc241730505 \h </w:instrText>
-            </w:r>
-            <w:r>
-              <w:rPr>
-                <w:noProof/>
-              </w:rPr>
-            </w:r>
-            <w:r>
-              <w:rPr>
-                <w:noProof/>
-              </w:rPr>
               <w:fldChar w:fldCharType="separate"/>
-            </w:r>
-            <w:r>
-              <w:rPr>
-                <w:noProof/>
-              </w:rPr>
               <w:t>10</w:t>
-            </w:r>
-            <w:r>
-              <w:rPr>
-                <w:noProof/>
-              </w:rPr>
               <w:fldChar w:fldCharType="end"/>
             </w:r>
           </w:hyperlink>
@@ -2090,40 +1297,10 @@
                 <w:noProof/>
               </w:rPr>
               <w:tab/>
-            </w:r>
-            <w:r>
-              <w:rPr>
-                <w:noProof/>
-              </w:rPr>
               <w:fldChar w:fldCharType="begin"/>
-            </w:r>
-            <w:r>
-              <w:rPr>
-                <w:noProof/>
-              </w:rPr>
               <w:instrText xml:space="preserve"> PAGEREF _Toc241730506 \h </w:instrText>
-            </w:r>
-            <w:r>
-              <w:rPr>
-                <w:noProof/>
-              </w:rPr>
-            </w:r>
-            <w:r>
-              <w:rPr>
-                <w:noProof/>
-              </w:rPr>
               <w:fldChar w:fldCharType="separate"/>
-            </w:r>
-            <w:r>
-              <w:rPr>
-                <w:noProof/>
-              </w:rPr>
               <w:t>11</w:t>
-            </w:r>
-            <w:r>
-              <w:rPr>
-                <w:noProof/>
-              </w:rPr>
               <w:fldChar w:fldCharType="end"/>
             </w:r>
           </w:hyperlink>
@@ -2153,40 +1330,10 @@
                 <w:noProof/>
               </w:rPr>
               <w:tab/>
-            </w:r>
-            <w:r>
-              <w:rPr>
-                <w:noProof/>
-              </w:rPr>
               <w:fldChar w:fldCharType="begin"/>
-            </w:r>
-            <w:r>
-              <w:rPr>
-                <w:noProof/>
-              </w:rPr>
               <w:instrText xml:space="preserve"> PAGEREF _Toc241730507 \h </w:instrText>
-            </w:r>
-            <w:r>
-              <w:rPr>
-                <w:noProof/>
-              </w:rPr>
-            </w:r>
-            <w:r>
-              <w:rPr>
-                <w:noProof/>
-              </w:rPr>
               <w:fldChar w:fldCharType="separate"/>
-            </w:r>
-            <w:r>
-              <w:rPr>
-                <w:noProof/>
-              </w:rPr>
               <w:t>11</w:t>
-            </w:r>
-            <w:r>
-              <w:rPr>
-                <w:noProof/>
-              </w:rPr>
               <w:fldChar w:fldCharType="end"/>
             </w:r>
           </w:hyperlink>
@@ -2216,40 +1363,10 @@
                 <w:noProof/>
               </w:rPr>
               <w:tab/>
-            </w:r>
-            <w:r>
-              <w:rPr>
-                <w:noProof/>
-              </w:rPr>
               <w:fldChar w:fldCharType="begin"/>
-            </w:r>
-            <w:r>
-              <w:rPr>
-                <w:noProof/>
-              </w:rPr>
               <w:instrText xml:space="preserve"> PAGEREF _Toc241730508 \h </w:instrText>
-            </w:r>
-            <w:r>
-              <w:rPr>
-                <w:noProof/>
-              </w:rPr>
-            </w:r>
-            <w:r>
-              <w:rPr>
-                <w:noProof/>
-              </w:rPr>
               <w:fldChar w:fldCharType="separate"/>
-            </w:r>
-            <w:r>
-              <w:rPr>
-                <w:noProof/>
-              </w:rPr>
               <w:t>11</w:t>
-            </w:r>
-            <w:r>
-              <w:rPr>
-                <w:noProof/>
-              </w:rPr>
               <w:fldChar w:fldCharType="end"/>
             </w:r>
           </w:hyperlink>
@@ -2279,40 +1396,10 @@
                 <w:noProof/>
               </w:rPr>
               <w:tab/>
-            </w:r>
-            <w:r>
-              <w:rPr>
-                <w:noProof/>
-              </w:rPr>
               <w:fldChar w:fldCharType="begin"/>
-            </w:r>
-            <w:r>
-              <w:rPr>
-                <w:noProof/>
-              </w:rPr>
               <w:instrText xml:space="preserve"> PAGEREF _Toc241730509 \h </w:instrText>
-            </w:r>
-            <w:r>
-              <w:rPr>
-                <w:noProof/>
-              </w:rPr>
-            </w:r>
-            <w:r>
-              <w:rPr>
-                <w:noProof/>
-              </w:rPr>
               <w:fldChar w:fldCharType="separate"/>
-            </w:r>
-            <w:r>
-              <w:rPr>
-                <w:noProof/>
-              </w:rPr>
               <w:t>12</w:t>
-            </w:r>
-            <w:r>
-              <w:rPr>
-                <w:noProof/>
-              </w:rPr>
               <w:fldChar w:fldCharType="end"/>
             </w:r>
           </w:hyperlink>
@@ -2342,40 +1429,10 @@
                 <w:noProof/>
               </w:rPr>
               <w:tab/>
-            </w:r>
-            <w:r>
-              <w:rPr>
-                <w:noProof/>
-              </w:rPr>
               <w:fldChar w:fldCharType="begin"/>
-            </w:r>
-            <w:r>
-              <w:rPr>
-                <w:noProof/>
-              </w:rPr>
               <w:instrText xml:space="preserve"> PAGEREF _Toc241730510 \h </w:instrText>
-            </w:r>
-            <w:r>
-              <w:rPr>
-                <w:noProof/>
-              </w:rPr>
-            </w:r>
-            <w:r>
-              <w:rPr>
-                <w:noProof/>
-              </w:rPr>
               <w:fldChar w:fldCharType="separate"/>
-            </w:r>
-            <w:r>
-              <w:rPr>
-                <w:noProof/>
-              </w:rPr>
               <w:t>12</w:t>
-            </w:r>
-            <w:r>
-              <w:rPr>
-                <w:noProof/>
-              </w:rPr>
               <w:fldChar w:fldCharType="end"/>
             </w:r>
           </w:hyperlink>
@@ -2405,40 +1462,10 @@
                 <w:noProof/>
               </w:rPr>
               <w:tab/>
-            </w:r>
-            <w:r>
-              <w:rPr>
-                <w:noProof/>
-              </w:rPr>
               <w:fldChar w:fldCharType="begin"/>
-            </w:r>
-            <w:r>
-              <w:rPr>
-                <w:noProof/>
-              </w:rPr>
               <w:instrText xml:space="preserve"> PAGEREF _Toc241730511 \h </w:instrText>
-            </w:r>
-            <w:r>
-              <w:rPr>
-                <w:noProof/>
-              </w:rPr>
-            </w:r>
-            <w:r>
-              <w:rPr>
-                <w:noProof/>
-              </w:rPr>
               <w:fldChar w:fldCharType="separate"/>
-            </w:r>
-            <w:r>
-              <w:rPr>
-                <w:noProof/>
-              </w:rPr>
               <w:t>12</w:t>
-            </w:r>
-            <w:r>
-              <w:rPr>
-                <w:noProof/>
-              </w:rPr>
               <w:fldChar w:fldCharType="end"/>
             </w:r>
           </w:hyperlink>
@@ -2468,40 +1495,10 @@
                 <w:noProof/>
               </w:rPr>
               <w:tab/>
-            </w:r>
-            <w:r>
-              <w:rPr>
-                <w:noProof/>
-              </w:rPr>
               <w:fldChar w:fldCharType="begin"/>
-            </w:r>
-            <w:r>
-              <w:rPr>
-                <w:noProof/>
-              </w:rPr>
               <w:instrText xml:space="preserve"> PAGEREF _Toc241730512 \h </w:instrText>
-            </w:r>
-            <w:r>
-              <w:rPr>
-                <w:noProof/>
-              </w:rPr>
-            </w:r>
-            <w:r>
-              <w:rPr>
-                <w:noProof/>
-              </w:rPr>
               <w:fldChar w:fldCharType="separate"/>
-            </w:r>
-            <w:r>
-              <w:rPr>
-                <w:noProof/>
-              </w:rPr>
               <w:t>12</w:t>
-            </w:r>
-            <w:r>
-              <w:rPr>
-                <w:noProof/>
-              </w:rPr>
               <w:fldChar w:fldCharType="end"/>
             </w:r>
           </w:hyperlink>
@@ -2531,40 +1528,10 @@
                 <w:noProof/>
               </w:rPr>
               <w:tab/>
-            </w:r>
-            <w:r>
-              <w:rPr>
-                <w:noProof/>
-              </w:rPr>
               <w:fldChar w:fldCharType="begin"/>
-            </w:r>
-            <w:r>
-              <w:rPr>
-                <w:noProof/>
-              </w:rPr>
               <w:instrText xml:space="preserve"> PAGEREF _Toc241730513 \h </w:instrText>
-            </w:r>
-            <w:r>
-              <w:rPr>
-                <w:noProof/>
-              </w:rPr>
-            </w:r>
-            <w:r>
-              <w:rPr>
-                <w:noProof/>
-              </w:rPr>
               <w:fldChar w:fldCharType="separate"/>
-            </w:r>
-            <w:r>
-              <w:rPr>
-                <w:noProof/>
-              </w:rPr>
               <w:t>13</w:t>
-            </w:r>
-            <w:r>
-              <w:rPr>
-                <w:noProof/>
-              </w:rPr>
               <w:fldChar w:fldCharType="end"/>
             </w:r>
           </w:hyperlink>
@@ -2596,40 +1563,10 @@
                 <w:noProof/>
               </w:rPr>
               <w:tab/>
-            </w:r>
-            <w:r>
-              <w:rPr>
-                <w:noProof/>
-              </w:rPr>
               <w:fldChar w:fldCharType="begin"/>
-            </w:r>
-            <w:r>
-              <w:rPr>
-                <w:noProof/>
-              </w:rPr>
               <w:instrText xml:space="preserve"> PAGEREF _Toc241730514 \h </w:instrText>
-            </w:r>
-            <w:r>
-              <w:rPr>
-                <w:noProof/>
-              </w:rPr>
-            </w:r>
-            <w:r>
-              <w:rPr>
-                <w:noProof/>
-              </w:rPr>
               <w:fldChar w:fldCharType="separate"/>
-            </w:r>
-            <w:r>
-              <w:rPr>
-                <w:noProof/>
-              </w:rPr>
               <w:t>14</w:t>
-            </w:r>
-            <w:r>
-              <w:rPr>
-                <w:noProof/>
-              </w:rPr>
               <w:fldChar w:fldCharType="end"/>
             </w:r>
           </w:hyperlink>
@@ -2659,40 +1596,10 @@
                 <w:noProof/>
               </w:rPr>
               <w:tab/>
-            </w:r>
-            <w:r>
-              <w:rPr>
-                <w:noProof/>
-              </w:rPr>
               <w:fldChar w:fldCharType="begin"/>
-            </w:r>
-            <w:r>
-              <w:rPr>
-                <w:noProof/>
-              </w:rPr>
               <w:instrText xml:space="preserve"> PAGEREF _Toc241730515 \h </w:instrText>
-            </w:r>
-            <w:r>
-              <w:rPr>
-                <w:noProof/>
-              </w:rPr>
-            </w:r>
-            <w:r>
-              <w:rPr>
-                <w:noProof/>
-              </w:rPr>
               <w:fldChar w:fldCharType="separate"/>
-            </w:r>
-            <w:r>
-              <w:rPr>
-                <w:noProof/>
-              </w:rPr>
               <w:t>14</w:t>
-            </w:r>
-            <w:r>
-              <w:rPr>
-                <w:noProof/>
-              </w:rPr>
               <w:fldChar w:fldCharType="end"/>
             </w:r>
           </w:hyperlink>
@@ -2722,40 +1629,10 @@
                 <w:noProof/>
               </w:rPr>
               <w:tab/>
-            </w:r>
-            <w:r>
-              <w:rPr>
-                <w:noProof/>
-              </w:rPr>
               <w:fldChar w:fldCharType="begin"/>
-            </w:r>
-            <w:r>
-              <w:rPr>
-                <w:noProof/>
-              </w:rPr>
               <w:instrText xml:space="preserve"> PAGEREF _Toc241730516 \h </w:instrText>
-            </w:r>
-            <w:r>
-              <w:rPr>
-                <w:noProof/>
-              </w:rPr>
-            </w:r>
-            <w:r>
-              <w:rPr>
-                <w:noProof/>
-              </w:rPr>
               <w:fldChar w:fldCharType="separate"/>
-            </w:r>
-            <w:r>
-              <w:rPr>
-                <w:noProof/>
-              </w:rPr>
               <w:t>15</w:t>
-            </w:r>
-            <w:r>
-              <w:rPr>
-                <w:noProof/>
-              </w:rPr>
               <w:fldChar w:fldCharType="end"/>
             </w:r>
           </w:hyperlink>
@@ -2785,40 +1662,10 @@
                 <w:noProof/>
               </w:rPr>
               <w:tab/>
-            </w:r>
-            <w:r>
-              <w:rPr>
-                <w:noProof/>
-              </w:rPr>
               <w:fldChar w:fldCharType="begin"/>
-            </w:r>
-            <w:r>
-              <w:rPr>
-                <w:noProof/>
-              </w:rPr>
               <w:instrText xml:space="preserve"> PAGEREF _Toc241730517 \h </w:instrText>
-            </w:r>
-            <w:r>
-              <w:rPr>
-                <w:noProof/>
-              </w:rPr>
-            </w:r>
-            <w:r>
-              <w:rPr>
-                <w:noProof/>
-              </w:rPr>
               <w:fldChar w:fldCharType="separate"/>
-            </w:r>
-            <w:r>
-              <w:rPr>
-                <w:noProof/>
-              </w:rPr>
               <w:t>15</w:t>
-            </w:r>
-            <w:r>
-              <w:rPr>
-                <w:noProof/>
-              </w:rPr>
               <w:fldChar w:fldCharType="end"/>
             </w:r>
           </w:hyperlink>
@@ -2848,40 +1695,10 @@
                 <w:noProof/>
               </w:rPr>
               <w:tab/>
-            </w:r>
-            <w:r>
-              <w:rPr>
-                <w:noProof/>
-              </w:rPr>
               <w:fldChar w:fldCharType="begin"/>
-            </w:r>
-            <w:r>
-              <w:rPr>
-                <w:noProof/>
-              </w:rPr>
               <w:instrText xml:space="preserve"> PAGEREF _Toc241730518 \h </w:instrText>
-            </w:r>
-            <w:r>
-              <w:rPr>
-                <w:noProof/>
-              </w:rPr>
-            </w:r>
-            <w:r>
-              <w:rPr>
-                <w:noProof/>
-              </w:rPr>
               <w:fldChar w:fldCharType="separate"/>
-            </w:r>
-            <w:r>
-              <w:rPr>
-                <w:noProof/>
-              </w:rPr>
               <w:t>16</w:t>
-            </w:r>
-            <w:r>
-              <w:rPr>
-                <w:noProof/>
-              </w:rPr>
               <w:fldChar w:fldCharType="end"/>
             </w:r>
           </w:hyperlink>
@@ -2911,40 +1728,10 @@
                 <w:noProof/>
               </w:rPr>
               <w:tab/>
-            </w:r>
-            <w:r>
-              <w:rPr>
-                <w:noProof/>
-              </w:rPr>
               <w:fldChar w:fldCharType="begin"/>
-            </w:r>
-            <w:r>
-              <w:rPr>
-                <w:noProof/>
-              </w:rPr>
               <w:instrText xml:space="preserve"> PAGEREF _Toc241730519 \h </w:instrText>
-            </w:r>
-            <w:r>
-              <w:rPr>
-                <w:noProof/>
-              </w:rPr>
-            </w:r>
-            <w:r>
-              <w:rPr>
-                <w:noProof/>
-              </w:rPr>
               <w:fldChar w:fldCharType="separate"/>
-            </w:r>
-            <w:r>
-              <w:rPr>
-                <w:noProof/>
-              </w:rPr>
               <w:t>17</w:t>
-            </w:r>
-            <w:r>
-              <w:rPr>
-                <w:noProof/>
-              </w:rPr>
               <w:fldChar w:fldCharType="end"/>
             </w:r>
           </w:hyperlink>
@@ -2974,40 +1761,10 @@
                 <w:noProof/>
               </w:rPr>
               <w:tab/>
-            </w:r>
-            <w:r>
-              <w:rPr>
-                <w:noProof/>
-              </w:rPr>
               <w:fldChar w:fldCharType="begin"/>
-            </w:r>
-            <w:r>
-              <w:rPr>
-                <w:noProof/>
-              </w:rPr>
               <w:instrText xml:space="preserve"> PAGEREF _Toc241730520 \h </w:instrText>
-            </w:r>
-            <w:r>
-              <w:rPr>
-                <w:noProof/>
-              </w:rPr>
-            </w:r>
-            <w:r>
-              <w:rPr>
-                <w:noProof/>
-              </w:rPr>
               <w:fldChar w:fldCharType="separate"/>
-            </w:r>
-            <w:r>
-              <w:rPr>
-                <w:noProof/>
-              </w:rPr>
               <w:t>17</w:t>
-            </w:r>
-            <w:r>
-              <w:rPr>
-                <w:noProof/>
-              </w:rPr>
               <w:fldChar w:fldCharType="end"/>
             </w:r>
           </w:hyperlink>
@@ -3037,40 +1794,10 @@
                 <w:noProof/>
               </w:rPr>
               <w:tab/>
-            </w:r>
-            <w:r>
-              <w:rPr>
-                <w:noProof/>
-              </w:rPr>
               <w:fldChar w:fldCharType="begin"/>
-            </w:r>
-            <w:r>
-              <w:rPr>
-                <w:noProof/>
-              </w:rPr>
               <w:instrText xml:space="preserve"> PAGEREF _Toc241730521 \h </w:instrText>
-            </w:r>
-            <w:r>
-              <w:rPr>
-                <w:noProof/>
-              </w:rPr>
-            </w:r>
-            <w:r>
-              <w:rPr>
-                <w:noProof/>
-              </w:rPr>
               <w:fldChar w:fldCharType="separate"/>
-            </w:r>
-            <w:r>
-              <w:rPr>
-                <w:noProof/>
-              </w:rPr>
               <w:t>17</w:t>
-            </w:r>
-            <w:r>
-              <w:rPr>
-                <w:noProof/>
-              </w:rPr>
               <w:fldChar w:fldCharType="end"/>
             </w:r>
           </w:hyperlink>
@@ -3100,40 +1827,10 @@
                 <w:noProof/>
               </w:rPr>
               <w:tab/>
-            </w:r>
-            <w:r>
-              <w:rPr>
-                <w:noProof/>
-              </w:rPr>
               <w:fldChar w:fldCharType="begin"/>
-            </w:r>
-            <w:r>
-              <w:rPr>
-                <w:noProof/>
-              </w:rPr>
               <w:instrText xml:space="preserve"> PAGEREF _Toc241730522 \h </w:instrText>
-            </w:r>
-            <w:r>
-              <w:rPr>
-                <w:noProof/>
-              </w:rPr>
-            </w:r>
-            <w:r>
-              <w:rPr>
-                <w:noProof/>
-              </w:rPr>
               <w:fldChar w:fldCharType="separate"/>
-            </w:r>
-            <w:r>
-              <w:rPr>
-                <w:noProof/>
-              </w:rPr>
               <w:t>17</w:t>
-            </w:r>
-            <w:r>
-              <w:rPr>
-                <w:noProof/>
-              </w:rPr>
               <w:fldChar w:fldCharType="end"/>
             </w:r>
           </w:hyperlink>
@@ -3163,40 +1860,10 @@
                 <w:noProof/>
               </w:rPr>
               <w:tab/>
-            </w:r>
-            <w:r>
-              <w:rPr>
-                <w:noProof/>
-              </w:rPr>
               <w:fldChar w:fldCharType="begin"/>
-            </w:r>
-            <w:r>
-              <w:rPr>
-                <w:noProof/>
-              </w:rPr>
               <w:instrText xml:space="preserve"> PAGEREF _Toc241730523 \h </w:instrText>
-            </w:r>
-            <w:r>
-              <w:rPr>
-                <w:noProof/>
-              </w:rPr>
-            </w:r>
-            <w:r>
-              <w:rPr>
-                <w:noProof/>
-              </w:rPr>
               <w:fldChar w:fldCharType="separate"/>
-            </w:r>
-            <w:r>
-              <w:rPr>
-                <w:noProof/>
-              </w:rPr>
               <w:t>18</w:t>
-            </w:r>
-            <w:r>
-              <w:rPr>
-                <w:noProof/>
-              </w:rPr>
               <w:fldChar w:fldCharType="end"/>
             </w:r>
           </w:hyperlink>
@@ -3226,40 +1893,10 @@
                 <w:noProof/>
               </w:rPr>
               <w:tab/>
-            </w:r>
-            <w:r>
-              <w:rPr>
-                <w:noProof/>
-              </w:rPr>
               <w:fldChar w:fldCharType="begin"/>
-            </w:r>
-            <w:r>
-              <w:rPr>
-                <w:noProof/>
-              </w:rPr>
               <w:instrText xml:space="preserve"> PAGEREF _Toc241730524 \h </w:instrText>
-            </w:r>
-            <w:r>
-              <w:rPr>
-                <w:noProof/>
-              </w:rPr>
-            </w:r>
-            <w:r>
-              <w:rPr>
-                <w:noProof/>
-              </w:rPr>
               <w:fldChar w:fldCharType="separate"/>
-            </w:r>
-            <w:r>
-              <w:rPr>
-                <w:noProof/>
-              </w:rPr>
               <w:t>18</w:t>
-            </w:r>
-            <w:r>
-              <w:rPr>
-                <w:noProof/>
-              </w:rPr>
               <w:fldChar w:fldCharType="end"/>
             </w:r>
           </w:hyperlink>
@@ -3289,40 +1926,10 @@
                 <w:noProof/>
               </w:rPr>
               <w:tab/>
-            </w:r>
-            <w:r>
-              <w:rPr>
-                <w:noProof/>
-              </w:rPr>
               <w:fldChar w:fldCharType="begin"/>
-            </w:r>
-            <w:r>
-              <w:rPr>
-                <w:noProof/>
-              </w:rPr>
               <w:instrText xml:space="preserve"> PAGEREF _Toc241730525 \h </w:instrText>
-            </w:r>
-            <w:r>
-              <w:rPr>
-                <w:noProof/>
-              </w:rPr>
-            </w:r>
-            <w:r>
-              <w:rPr>
-                <w:noProof/>
-              </w:rPr>
               <w:fldChar w:fldCharType="separate"/>
-            </w:r>
-            <w:r>
-              <w:rPr>
-                <w:noProof/>
-              </w:rPr>
               <w:t>19</w:t>
-            </w:r>
-            <w:r>
-              <w:rPr>
-                <w:noProof/>
-              </w:rPr>
               <w:fldChar w:fldCharType="end"/>
             </w:r>
           </w:hyperlink>
@@ -3352,40 +1959,10 @@
                 <w:noProof/>
               </w:rPr>
               <w:tab/>
-            </w:r>
-            <w:r>
-              <w:rPr>
-                <w:noProof/>
-              </w:rPr>
               <w:fldChar w:fldCharType="begin"/>
-            </w:r>
-            <w:r>
-              <w:rPr>
-                <w:noProof/>
-              </w:rPr>
               <w:instrText xml:space="preserve"> PAGEREF _Toc241730526 \h </w:instrText>
-            </w:r>
-            <w:r>
-              <w:rPr>
-                <w:noProof/>
-              </w:rPr>
-            </w:r>
-            <w:r>
-              <w:rPr>
-                <w:noProof/>
-              </w:rPr>
               <w:fldChar w:fldCharType="separate"/>
-            </w:r>
-            <w:r>
-              <w:rPr>
-                <w:noProof/>
-              </w:rPr>
               <w:t>19</w:t>
-            </w:r>
-            <w:r>
-              <w:rPr>
-                <w:noProof/>
-              </w:rPr>
               <w:fldChar w:fldCharType="end"/>
             </w:r>
           </w:hyperlink>
@@ -3417,40 +1994,10 @@
                 <w:noProof/>
               </w:rPr>
               <w:tab/>
-            </w:r>
-            <w:r>
-              <w:rPr>
-                <w:noProof/>
-              </w:rPr>
               <w:fldChar w:fldCharType="begin"/>
-            </w:r>
-            <w:r>
-              <w:rPr>
-                <w:noProof/>
-              </w:rPr>
               <w:instrText xml:space="preserve"> PAGEREF _Toc241730527 \h </w:instrText>
-            </w:r>
-            <w:r>
-              <w:rPr>
-                <w:noProof/>
-              </w:rPr>
-            </w:r>
-            <w:r>
-              <w:rPr>
-                <w:noProof/>
-              </w:rPr>
               <w:fldChar w:fldCharType="separate"/>
-            </w:r>
-            <w:r>
-              <w:rPr>
-                <w:noProof/>
-              </w:rPr>
               <w:t>19</w:t>
-            </w:r>
-            <w:r>
-              <w:rPr>
-                <w:noProof/>
-              </w:rPr>
               <w:fldChar w:fldCharType="end"/>
             </w:r>
           </w:hyperlink>
@@ -3482,40 +2029,10 @@
                 <w:noProof/>
               </w:rPr>
               <w:tab/>
-            </w:r>
-            <w:r>
-              <w:rPr>
-                <w:noProof/>
-              </w:rPr>
               <w:fldChar w:fldCharType="begin"/>
-            </w:r>
-            <w:r>
-              <w:rPr>
-                <w:noProof/>
-              </w:rPr>
               <w:instrText xml:space="preserve"> PAGEREF _Toc241730528 \h </w:instrText>
-            </w:r>
-            <w:r>
-              <w:rPr>
-                <w:noProof/>
-              </w:rPr>
-            </w:r>
-            <w:r>
-              <w:rPr>
-                <w:noProof/>
-              </w:rPr>
               <w:fldChar w:fldCharType="separate"/>
-            </w:r>
-            <w:r>
-              <w:rPr>
-                <w:noProof/>
-              </w:rPr>
               <w:t>19</w:t>
-            </w:r>
-            <w:r>
-              <w:rPr>
-                <w:noProof/>
-              </w:rPr>
               <w:fldChar w:fldCharType="end"/>
             </w:r>
           </w:hyperlink>
@@ -3547,40 +2064,10 @@
                 <w:noProof/>
               </w:rPr>
               <w:tab/>
-            </w:r>
-            <w:r>
-              <w:rPr>
-                <w:noProof/>
-              </w:rPr>
               <w:fldChar w:fldCharType="begin"/>
-            </w:r>
-            <w:r>
-              <w:rPr>
-                <w:noProof/>
-              </w:rPr>
               <w:instrText xml:space="preserve"> PAGEREF _Toc241730529 \h </w:instrText>
-            </w:r>
-            <w:r>
-              <w:rPr>
-                <w:noProof/>
-              </w:rPr>
-            </w:r>
-            <w:r>
-              <w:rPr>
-                <w:noProof/>
-              </w:rPr>
               <w:fldChar w:fldCharType="separate"/>
-            </w:r>
-            <w:r>
-              <w:rPr>
-                <w:noProof/>
-              </w:rPr>
               <w:t>20</w:t>
-            </w:r>
-            <w:r>
-              <w:rPr>
-                <w:noProof/>
-              </w:rPr>
               <w:fldChar w:fldCharType="end"/>
             </w:r>
           </w:hyperlink>
@@ -3612,40 +2099,10 @@
                 <w:noProof/>
               </w:rPr>
               <w:tab/>
-            </w:r>
-            <w:r>
-              <w:rPr>
-                <w:noProof/>
-              </w:rPr>
               <w:fldChar w:fldCharType="begin"/>
-            </w:r>
-            <w:r>
-              <w:rPr>
-                <w:noProof/>
-              </w:rPr>
               <w:instrText xml:space="preserve"> PAGEREF _Toc241730530 \h </w:instrText>
-            </w:r>
-            <w:r>
-              <w:rPr>
-                <w:noProof/>
-              </w:rPr>
-            </w:r>
-            <w:r>
-              <w:rPr>
-                <w:noProof/>
-              </w:rPr>
               <w:fldChar w:fldCharType="separate"/>
-            </w:r>
-            <w:r>
-              <w:rPr>
-                <w:noProof/>
-              </w:rPr>
               <w:t>21</w:t>
-            </w:r>
-            <w:r>
-              <w:rPr>
-                <w:noProof/>
-              </w:rPr>
               <w:fldChar w:fldCharType="end"/>
             </w:r>
           </w:hyperlink>
@@ -3677,40 +2134,10 @@
                 <w:noProof/>
               </w:rPr>
               <w:tab/>
-            </w:r>
-            <w:r>
-              <w:rPr>
-                <w:noProof/>
-              </w:rPr>
               <w:fldChar w:fldCharType="begin"/>
-            </w:r>
-            <w:r>
-              <w:rPr>
-                <w:noProof/>
-              </w:rPr>
               <w:instrText xml:space="preserve"> PAGEREF _Toc241730531 \h </w:instrText>
-            </w:r>
-            <w:r>
-              <w:rPr>
-                <w:noProof/>
-              </w:rPr>
-            </w:r>
-            <w:r>
-              <w:rPr>
-                <w:noProof/>
-              </w:rPr>
               <w:fldChar w:fldCharType="separate"/>
-            </w:r>
-            <w:r>
-              <w:rPr>
-                <w:noProof/>
-              </w:rPr>
               <w:t>22</w:t>
-            </w:r>
-            <w:r>
-              <w:rPr>
-                <w:noProof/>
-              </w:rPr>
               <w:fldChar w:fldCharType="end"/>
             </w:r>
           </w:hyperlink>
@@ -3740,40 +2167,10 @@
                 <w:noProof/>
               </w:rPr>
               <w:tab/>
-            </w:r>
-            <w:r>
-              <w:rPr>
-                <w:noProof/>
-              </w:rPr>
               <w:fldChar w:fldCharType="begin"/>
-            </w:r>
-            <w:r>
-              <w:rPr>
-                <w:noProof/>
-              </w:rPr>
               <w:instrText xml:space="preserve"> PAGEREF _Toc241730532 \h </w:instrText>
-            </w:r>
-            <w:r>
-              <w:rPr>
-                <w:noProof/>
-              </w:rPr>
-            </w:r>
-            <w:r>
-              <w:rPr>
-                <w:noProof/>
-              </w:rPr>
               <w:fldChar w:fldCharType="separate"/>
-            </w:r>
-            <w:r>
-              <w:rPr>
-                <w:noProof/>
-              </w:rPr>
               <w:t>22</w:t>
-            </w:r>
-            <w:r>
-              <w:rPr>
-                <w:noProof/>
-              </w:rPr>
               <w:fldChar w:fldCharType="end"/>
             </w:r>
           </w:hyperlink>
@@ -3803,40 +2200,10 @@
                 <w:noProof/>
               </w:rPr>
               <w:tab/>
-            </w:r>
-            <w:r>
-              <w:rPr>
-                <w:noProof/>
-              </w:rPr>
               <w:fldChar w:fldCharType="begin"/>
-            </w:r>
-            <w:r>
-              <w:rPr>
-                <w:noProof/>
-              </w:rPr>
               <w:instrText xml:space="preserve"> PAGEREF _Toc241730533 \h </w:instrText>
-            </w:r>
-            <w:r>
-              <w:rPr>
-                <w:noProof/>
-              </w:rPr>
-            </w:r>
-            <w:r>
-              <w:rPr>
-                <w:noProof/>
-              </w:rPr>
               <w:fldChar w:fldCharType="separate"/>
-            </w:r>
-            <w:r>
-              <w:rPr>
-                <w:noProof/>
-              </w:rPr>
               <w:t>23</w:t>
-            </w:r>
-            <w:r>
-              <w:rPr>
-                <w:noProof/>
-              </w:rPr>
               <w:fldChar w:fldCharType="end"/>
             </w:r>
           </w:hyperlink>
@@ -3866,40 +2233,10 @@
                 <w:noProof/>
               </w:rPr>
               <w:tab/>
-            </w:r>
-            <w:r>
-              <w:rPr>
-                <w:noProof/>
-              </w:rPr>
               <w:fldChar w:fldCharType="begin"/>
-            </w:r>
-            <w:r>
-              <w:rPr>
-                <w:noProof/>
-              </w:rPr>
               <w:instrText xml:space="preserve"> PAGEREF _Toc241730534 \h </w:instrText>
-            </w:r>
-            <w:r>
-              <w:rPr>
-                <w:noProof/>
-              </w:rPr>
-            </w:r>
-            <w:r>
-              <w:rPr>
-                <w:noProof/>
-              </w:rPr>
               <w:fldChar w:fldCharType="separate"/>
-            </w:r>
-            <w:r>
-              <w:rPr>
-                <w:noProof/>
-              </w:rPr>
               <w:t>23</w:t>
-            </w:r>
-            <w:r>
-              <w:rPr>
-                <w:noProof/>
-              </w:rPr>
               <w:fldChar w:fldCharType="end"/>
             </w:r>
           </w:hyperlink>
@@ -3929,40 +2266,10 @@
                 <w:noProof/>
               </w:rPr>
               <w:tab/>
-            </w:r>
-            <w:r>
-              <w:rPr>
-                <w:noProof/>
-              </w:rPr>
               <w:fldChar w:fldCharType="begin"/>
-            </w:r>
-            <w:r>
-              <w:rPr>
-                <w:noProof/>
-              </w:rPr>
               <w:instrText xml:space="preserve"> PAGEREF _Toc241730535 \h </w:instrText>
-            </w:r>
-            <w:r>
-              <w:rPr>
-                <w:noProof/>
-              </w:rPr>
-            </w:r>
-            <w:r>
-              <w:rPr>
-                <w:noProof/>
-              </w:rPr>
               <w:fldChar w:fldCharType="separate"/>
-            </w:r>
-            <w:r>
-              <w:rPr>
-                <w:noProof/>
-              </w:rPr>
               <w:t>23</w:t>
-            </w:r>
-            <w:r>
-              <w:rPr>
-                <w:noProof/>
-              </w:rPr>
               <w:fldChar w:fldCharType="end"/>
             </w:r>
           </w:hyperlink>
@@ -3992,40 +2299,10 @@
                 <w:noProof/>
               </w:rPr>
               <w:tab/>
-            </w:r>
-            <w:r>
-              <w:rPr>
-                <w:noProof/>
-              </w:rPr>
               <w:fldChar w:fldCharType="begin"/>
-            </w:r>
-            <w:r>
-              <w:rPr>
-                <w:noProof/>
-              </w:rPr>
               <w:instrText xml:space="preserve"> PAGEREF _Toc241730536 \h </w:instrText>
-            </w:r>
-            <w:r>
-              <w:rPr>
-                <w:noProof/>
-              </w:rPr>
-            </w:r>
-            <w:r>
-              <w:rPr>
-                <w:noProof/>
-              </w:rPr>
               <w:fldChar w:fldCharType="separate"/>
-            </w:r>
-            <w:r>
-              <w:rPr>
-                <w:noProof/>
-              </w:rPr>
               <w:t>23</w:t>
-            </w:r>
-            <w:r>
-              <w:rPr>
-                <w:noProof/>
-              </w:rPr>
               <w:fldChar w:fldCharType="end"/>
             </w:r>
           </w:hyperlink>
@@ -4055,40 +2332,10 @@
                 <w:noProof/>
               </w:rPr>
               <w:tab/>
-            </w:r>
-            <w:r>
-              <w:rPr>
-                <w:noProof/>
-              </w:rPr>
               <w:fldChar w:fldCharType="begin"/>
-            </w:r>
-            <w:r>
-              <w:rPr>
-                <w:noProof/>
-              </w:rPr>
               <w:instrText xml:space="preserve"> PAGEREF _Toc241730537 \h </w:instrText>
-            </w:r>
-            <w:r>
-              <w:rPr>
-                <w:noProof/>
-              </w:rPr>
-            </w:r>
-            <w:r>
-              <w:rPr>
-                <w:noProof/>
-              </w:rPr>
               <w:fldChar w:fldCharType="separate"/>
-            </w:r>
-            <w:r>
-              <w:rPr>
-                <w:noProof/>
-              </w:rPr>
               <w:t>24</w:t>
-            </w:r>
-            <w:r>
-              <w:rPr>
-                <w:noProof/>
-              </w:rPr>
               <w:fldChar w:fldCharType="end"/>
             </w:r>
           </w:hyperlink>
@@ -4118,40 +2365,10 @@
                 <w:noProof/>
               </w:rPr>
               <w:tab/>
-            </w:r>
-            <w:r>
-              <w:rPr>
-                <w:noProof/>
-              </w:rPr>
               <w:fldChar w:fldCharType="begin"/>
-            </w:r>
-            <w:r>
-              <w:rPr>
-                <w:noProof/>
-              </w:rPr>
               <w:instrText xml:space="preserve"> PAGEREF _Toc241730538 \h </w:instrText>
-            </w:r>
-            <w:r>
-              <w:rPr>
-                <w:noProof/>
-              </w:rPr>
-            </w:r>
-            <w:r>
-              <w:rPr>
-                <w:noProof/>
-              </w:rPr>
               <w:fldChar w:fldCharType="separate"/>
-            </w:r>
-            <w:r>
-              <w:rPr>
-                <w:noProof/>
-              </w:rPr>
               <w:t>25</w:t>
-            </w:r>
-            <w:r>
-              <w:rPr>
-                <w:noProof/>
-              </w:rPr>
               <w:fldChar w:fldCharType="end"/>
             </w:r>
           </w:hyperlink>
@@ -4181,40 +2398,10 @@
                 <w:noProof/>
               </w:rPr>
               <w:tab/>
-            </w:r>
-            <w:r>
-              <w:rPr>
-                <w:noProof/>
-              </w:rPr>
               <w:fldChar w:fldCharType="begin"/>
-            </w:r>
-            <w:r>
-              <w:rPr>
-                <w:noProof/>
-              </w:rPr>
               <w:instrText xml:space="preserve"> PAGEREF _Toc241730539 \h </w:instrText>
-            </w:r>
-            <w:r>
-              <w:rPr>
-                <w:noProof/>
-              </w:rPr>
-            </w:r>
-            <w:r>
-              <w:rPr>
-                <w:noProof/>
-              </w:rPr>
               <w:fldChar w:fldCharType="separate"/>
-            </w:r>
-            <w:r>
-              <w:rPr>
-                <w:noProof/>
-              </w:rPr>
               <w:t>26</w:t>
-            </w:r>
-            <w:r>
-              <w:rPr>
-                <w:noProof/>
-              </w:rPr>
               <w:fldChar w:fldCharType="end"/>
             </w:r>
           </w:hyperlink>
@@ -4244,40 +2431,10 @@
                 <w:noProof/>
               </w:rPr>
               <w:tab/>
-            </w:r>
-            <w:r>
-              <w:rPr>
-                <w:noProof/>
-              </w:rPr>
               <w:fldChar w:fldCharType="begin"/>
-            </w:r>
-            <w:r>
-              <w:rPr>
-                <w:noProof/>
-              </w:rPr>
               <w:instrText xml:space="preserve"> PAGEREF _Toc241730540 \h </w:instrText>
-            </w:r>
-            <w:r>
-              <w:rPr>
-                <w:noProof/>
-              </w:rPr>
-            </w:r>
-            <w:r>
-              <w:rPr>
-                <w:noProof/>
-              </w:rPr>
               <w:fldChar w:fldCharType="separate"/>
-            </w:r>
-            <w:r>
-              <w:rPr>
-                <w:noProof/>
-              </w:rPr>
               <w:t>26</w:t>
-            </w:r>
-            <w:r>
-              <w:rPr>
-                <w:noProof/>
-              </w:rPr>
               <w:fldChar w:fldCharType="end"/>
             </w:r>
           </w:hyperlink>
@@ -4307,40 +2464,10 @@
                 <w:noProof/>
               </w:rPr>
               <w:tab/>
-            </w:r>
-            <w:r>
-              <w:rPr>
-                <w:noProof/>
-              </w:rPr>
               <w:fldChar w:fldCharType="begin"/>
-            </w:r>
-            <w:r>
-              <w:rPr>
-                <w:noProof/>
-              </w:rPr>
               <w:instrText xml:space="preserve"> PAGEREF _Toc241730541 \h </w:instrText>
-            </w:r>
-            <w:r>
-              <w:rPr>
-                <w:noProof/>
-              </w:rPr>
-            </w:r>
-            <w:r>
-              <w:rPr>
-                <w:noProof/>
-              </w:rPr>
               <w:fldChar w:fldCharType="separate"/>
-            </w:r>
-            <w:r>
-              <w:rPr>
-                <w:noProof/>
-              </w:rPr>
               <w:t>26</w:t>
-            </w:r>
-            <w:r>
-              <w:rPr>
-                <w:noProof/>
-              </w:rPr>
               <w:fldChar w:fldCharType="end"/>
             </w:r>
           </w:hyperlink>
@@ -4370,40 +2497,10 @@
                 <w:noProof/>
               </w:rPr>
               <w:tab/>
-            </w:r>
-            <w:r>
-              <w:rPr>
-                <w:noProof/>
-              </w:rPr>
               <w:fldChar w:fldCharType="begin"/>
-            </w:r>
-            <w:r>
-              <w:rPr>
-                <w:noProof/>
-              </w:rPr>
               <w:instrText xml:space="preserve"> PAGEREF _Toc241730542 \h </w:instrText>
-            </w:r>
-            <w:r>
-              <w:rPr>
-                <w:noProof/>
-              </w:rPr>
-            </w:r>
-            <w:r>
-              <w:rPr>
-                <w:noProof/>
-              </w:rPr>
               <w:fldChar w:fldCharType="separate"/>
-            </w:r>
-            <w:r>
-              <w:rPr>
-                <w:noProof/>
-              </w:rPr>
               <w:t>26</w:t>
-            </w:r>
-            <w:r>
-              <w:rPr>
-                <w:noProof/>
-              </w:rPr>
               <w:fldChar w:fldCharType="end"/>
             </w:r>
           </w:hyperlink>
@@ -4433,40 +2530,10 @@
                 <w:noProof/>
               </w:rPr>
               <w:tab/>
-            </w:r>
-            <w:r>
-              <w:rPr>
-                <w:noProof/>
-              </w:rPr>
               <w:fldChar w:fldCharType="begin"/>
-            </w:r>
-            <w:r>
-              <w:rPr>
-                <w:noProof/>
-              </w:rPr>
               <w:instrText xml:space="preserve"> PAGEREF _Toc241730543 \h </w:instrText>
-            </w:r>
-            <w:r>
-              <w:rPr>
-                <w:noProof/>
-              </w:rPr>
-            </w:r>
-            <w:r>
-              <w:rPr>
-                <w:noProof/>
-              </w:rPr>
               <w:fldChar w:fldCharType="separate"/>
-            </w:r>
-            <w:r>
-              <w:rPr>
-                <w:noProof/>
-              </w:rPr>
               <w:t>28</w:t>
-            </w:r>
-            <w:r>
-              <w:rPr>
-                <w:noProof/>
-              </w:rPr>
               <w:fldChar w:fldCharType="end"/>
             </w:r>
           </w:hyperlink>
@@ -4496,40 +2563,10 @@
                 <w:noProof/>
               </w:rPr>
               <w:tab/>
-            </w:r>
-            <w:r>
-              <w:rPr>
-                <w:noProof/>
-              </w:rPr>
               <w:fldChar w:fldCharType="begin"/>
-            </w:r>
-            <w:r>
-              <w:rPr>
-                <w:noProof/>
-              </w:rPr>
               <w:instrText xml:space="preserve"> PAGEREF _Toc241730544 \h </w:instrText>
-            </w:r>
-            <w:r>
-              <w:rPr>
-                <w:noProof/>
-              </w:rPr>
-            </w:r>
-            <w:r>
-              <w:rPr>
-                <w:noProof/>
-              </w:rPr>
               <w:fldChar w:fldCharType="separate"/>
-            </w:r>
-            <w:r>
-              <w:rPr>
-                <w:noProof/>
-              </w:rPr>
               <w:t>29</w:t>
-            </w:r>
-            <w:r>
-              <w:rPr>
-                <w:noProof/>
-              </w:rPr>
               <w:fldChar w:fldCharType="end"/>
             </w:r>
           </w:hyperlink>
@@ -4559,40 +2596,10 @@
                 <w:noProof/>
               </w:rPr>
               <w:tab/>
-            </w:r>
-            <w:r>
-              <w:rPr>
-                <w:noProof/>
-              </w:rPr>
               <w:fldChar w:fldCharType="begin"/>
-            </w:r>
-            <w:r>
-              <w:rPr>
-                <w:noProof/>
-              </w:rPr>
               <w:instrText xml:space="preserve"> PAGEREF _Toc241730545 \h </w:instrText>
-            </w:r>
-            <w:r>
-              <w:rPr>
-                <w:noProof/>
-              </w:rPr>
-            </w:r>
-            <w:r>
-              <w:rPr>
-                <w:noProof/>
-              </w:rPr>
               <w:fldChar w:fldCharType="separate"/>
-            </w:r>
-            <w:r>
-              <w:rPr>
-                <w:noProof/>
-              </w:rPr>
               <w:t>29</w:t>
-            </w:r>
-            <w:r>
-              <w:rPr>
-                <w:noProof/>
-              </w:rPr>
               <w:fldChar w:fldCharType="end"/>
             </w:r>
           </w:hyperlink>
@@ -4622,40 +2629,10 @@
                 <w:noProof/>
               </w:rPr>
               <w:tab/>
-            </w:r>
-            <w:r>
-              <w:rPr>
-                <w:noProof/>
-              </w:rPr>
               <w:fldChar w:fldCharType="begin"/>
-            </w:r>
-            <w:r>
-              <w:rPr>
-                <w:noProof/>
-              </w:rPr>
               <w:instrText xml:space="preserve"> PAGEREF _Toc241730546 \h </w:instrText>
-            </w:r>
-            <w:r>
-              <w:rPr>
-                <w:noProof/>
-              </w:rPr>
-            </w:r>
-            <w:r>
-              <w:rPr>
-                <w:noProof/>
-              </w:rPr>
               <w:fldChar w:fldCharType="separate"/>
-            </w:r>
-            <w:r>
-              <w:rPr>
-                <w:noProof/>
-              </w:rPr>
               <w:t>31</w:t>
-            </w:r>
-            <w:r>
-              <w:rPr>
-                <w:noProof/>
-              </w:rPr>
               <w:fldChar w:fldCharType="end"/>
             </w:r>
           </w:hyperlink>
@@ -4685,40 +2662,10 @@
                 <w:noProof/>
               </w:rPr>
               <w:tab/>
-            </w:r>
-            <w:r>
-              <w:rPr>
-                <w:noProof/>
-              </w:rPr>
               <w:fldChar w:fldCharType="begin"/>
-            </w:r>
-            <w:r>
-              <w:rPr>
-                <w:noProof/>
-              </w:rPr>
               <w:instrText xml:space="preserve"> PAGEREF _Toc241730547 \h </w:instrText>
-            </w:r>
-            <w:r>
-              <w:rPr>
-                <w:noProof/>
-              </w:rPr>
-            </w:r>
-            <w:r>
-              <w:rPr>
-                <w:noProof/>
-              </w:rPr>
               <w:fldChar w:fldCharType="separate"/>
-            </w:r>
-            <w:r>
-              <w:rPr>
-                <w:noProof/>
-              </w:rPr>
               <w:t>31</w:t>
-            </w:r>
-            <w:r>
-              <w:rPr>
-                <w:noProof/>
-              </w:rPr>
               <w:fldChar w:fldCharType="end"/>
             </w:r>
           </w:hyperlink>
@@ -4748,40 +2695,10 @@
                 <w:noProof/>
               </w:rPr>
               <w:tab/>
-            </w:r>
-            <w:r>
-              <w:rPr>
-                <w:noProof/>
-              </w:rPr>
               <w:fldChar w:fldCharType="begin"/>
-            </w:r>
-            <w:r>
-              <w:rPr>
-                <w:noProof/>
-              </w:rPr>
               <w:instrText xml:space="preserve"> PAGEREF _Toc241730548 \h </w:instrText>
-            </w:r>
-            <w:r>
-              <w:rPr>
-                <w:noProof/>
-              </w:rPr>
-            </w:r>
-            <w:r>
-              <w:rPr>
-                <w:noProof/>
-              </w:rPr>
               <w:fldChar w:fldCharType="separate"/>
-            </w:r>
-            <w:r>
-              <w:rPr>
-                <w:noProof/>
-              </w:rPr>
               <w:t>31</w:t>
-            </w:r>
-            <w:r>
-              <w:rPr>
-                <w:noProof/>
-              </w:rPr>
               <w:fldChar w:fldCharType="end"/>
             </w:r>
           </w:hyperlink>
@@ -4811,40 +2728,10 @@
                 <w:noProof/>
               </w:rPr>
               <w:tab/>
-            </w:r>
-            <w:r>
-              <w:rPr>
-                <w:noProof/>
-              </w:rPr>
               <w:fldChar w:fldCharType="begin"/>
-            </w:r>
-            <w:r>
-              <w:rPr>
-                <w:noProof/>
-              </w:rPr>
               <w:instrText xml:space="preserve"> PAGEREF _Toc241730549 \h </w:instrText>
-            </w:r>
-            <w:r>
-              <w:rPr>
-                <w:noProof/>
-              </w:rPr>
-            </w:r>
-            <w:r>
-              <w:rPr>
-                <w:noProof/>
-              </w:rPr>
               <w:fldChar w:fldCharType="separate"/>
-            </w:r>
-            <w:r>
-              <w:rPr>
-                <w:noProof/>
-              </w:rPr>
               <w:t>32</w:t>
-            </w:r>
-            <w:r>
-              <w:rPr>
-                <w:noProof/>
-              </w:rPr>
               <w:fldChar w:fldCharType="end"/>
             </w:r>
           </w:hyperlink>
@@ -4874,40 +2761,10 @@
                 <w:noProof/>
               </w:rPr>
               <w:tab/>
-            </w:r>
-            <w:r>
-              <w:rPr>
-                <w:noProof/>
-              </w:rPr>
               <w:fldChar w:fldCharType="begin"/>
-            </w:r>
-            <w:r>
-              <w:rPr>
-                <w:noProof/>
-              </w:rPr>
               <w:instrText xml:space="preserve"> PAGEREF _Toc241730550 \h </w:instrText>
-            </w:r>
-            <w:r>
-              <w:rPr>
-                <w:noProof/>
-              </w:rPr>
-            </w:r>
-            <w:r>
-              <w:rPr>
-                <w:noProof/>
-              </w:rPr>
               <w:fldChar w:fldCharType="separate"/>
-            </w:r>
-            <w:r>
-              <w:rPr>
-                <w:noProof/>
-              </w:rPr>
               <w:t>33</w:t>
-            </w:r>
-            <w:r>
-              <w:rPr>
-                <w:noProof/>
-              </w:rPr>
               <w:fldChar w:fldCharType="end"/>
             </w:r>
           </w:hyperlink>
@@ -4937,40 +2794,10 @@
                 <w:noProof/>
               </w:rPr>
               <w:tab/>
-            </w:r>
-            <w:r>
-              <w:rPr>
-                <w:noProof/>
-              </w:rPr>
               <w:fldChar w:fldCharType="begin"/>
-            </w:r>
-            <w:r>
-              <w:rPr>
-                <w:noProof/>
-              </w:rPr>
               <w:instrText xml:space="preserve"> PAGEREF _Toc241730551 \h </w:instrText>
-            </w:r>
-            <w:r>
-              <w:rPr>
-                <w:noProof/>
-              </w:rPr>
-            </w:r>
-            <w:r>
-              <w:rPr>
-                <w:noProof/>
-              </w:rPr>
               <w:fldChar w:fldCharType="separate"/>
-            </w:r>
-            <w:r>
-              <w:rPr>
-                <w:noProof/>
-              </w:rPr>
               <w:t>33</w:t>
-            </w:r>
-            <w:r>
-              <w:rPr>
-                <w:noProof/>
-              </w:rPr>
               <w:fldChar w:fldCharType="end"/>
             </w:r>
           </w:hyperlink>
@@ -5000,40 +2827,10 @@
                 <w:noProof/>
               </w:rPr>
               <w:tab/>
-            </w:r>
-            <w:r>
-              <w:rPr>
-                <w:noProof/>
-              </w:rPr>
               <w:fldChar w:fldCharType="begin"/>
-            </w:r>
-            <w:r>
-              <w:rPr>
-                <w:noProof/>
-              </w:rPr>
               <w:instrText xml:space="preserve"> PAGEREF _Toc241730552 \h </w:instrText>
-            </w:r>
-            <w:r>
-              <w:rPr>
-                <w:noProof/>
-              </w:rPr>
-            </w:r>
-            <w:r>
-              <w:rPr>
-                <w:noProof/>
-              </w:rPr>
               <w:fldChar w:fldCharType="separate"/>
-            </w:r>
-            <w:r>
-              <w:rPr>
-                <w:noProof/>
-              </w:rPr>
               <w:t>34</w:t>
-            </w:r>
-            <w:r>
-              <w:rPr>
-                <w:noProof/>
-              </w:rPr>
               <w:fldChar w:fldCharType="end"/>
             </w:r>
           </w:hyperlink>
@@ -5063,40 +2860,10 @@
                 <w:noProof/>
               </w:rPr>
               <w:tab/>
-            </w:r>
-            <w:r>
-              <w:rPr>
-                <w:noProof/>
-              </w:rPr>
               <w:fldChar w:fldCharType="begin"/>
-            </w:r>
-            <w:r>
-              <w:rPr>
-                <w:noProof/>
-              </w:rPr>
               <w:instrText xml:space="preserve"> PAGEREF _Toc241730553 \h </w:instrText>
-            </w:r>
-            <w:r>
-              <w:rPr>
-                <w:noProof/>
-              </w:rPr>
-            </w:r>
-            <w:r>
-              <w:rPr>
-                <w:noProof/>
-              </w:rPr>
               <w:fldChar w:fldCharType="separate"/>
-            </w:r>
-            <w:r>
-              <w:rPr>
-                <w:noProof/>
-              </w:rPr>
               <w:t>35</w:t>
-            </w:r>
-            <w:r>
-              <w:rPr>
-                <w:noProof/>
-              </w:rPr>
               <w:fldChar w:fldCharType="end"/>
             </w:r>
           </w:hyperlink>
@@ -5191,13 +2958,7 @@
         <w:jc w:val="both"/>
       </w:pPr>
       <w:r>
-        <w:t>Sri Lanka’s IT sector is growing quickly, but the mechanism connecting undergraduates to internships has not kept pace. Thousands of students email unsolicited CVs to companies each recruitment cycle; companies manually screen hundreds of unranked applications for a handful of positions; and universities have no systemic visibility into where, or whether, their students are being placed. Research into Sri Lankan graduate employability has repeatedly identified a mismatch between the skills graduates hold an</w:t>
-      </w:r>
-      <w:r>
-        <w:t xml:space="preserve">d the skills employers actually need </w:t>
-      </w:r>
-      <w:r>
-        <w:t>[2], with lack of verifiable industry experience cited as a primary employment barrier independent of academic performance.</w:t>
+        <w:t xml:space="preserve">Sri Lanka’s IT sector is growing quickly, but the mechanism connecting undergraduates to internships has not kept pace. Thousands of students email unsolicited CVs to companies each recruitment cycle; companies manually screen hundreds of unranked applications for a handful of positions; and universities have no systemic visibility into where, or whether, their students are being placed. Research into Sri Lankan graduate employability has repeatedly identified a mismatch between the skills graduates hold and the skills employers actually need [2], with lack of verifiable industry experience cited as a primary employment barrier independent of academic performance.</w:t>
       </w:r>
     </w:p>
     <w:p>
@@ -5206,10 +2967,7 @@
         <w:jc w:val="both"/>
       </w:pPr>
       <w:r>
-        <w:t xml:space="preserve">Existing platforms do not close this gap. TopJobs.lk, Sri Lanka’s largest job portal, is fundamentally a job board: it lets employers post vacancies and collect CVs, with grading and shortlisting tools for the employer side, but it performs no candidate-to-vacancy matching and has no university-facing reporting layer. International platforms built for exactly this problem — Handshake, Internshala — are not localised for the Sri Lankan market and are not integrated with local university placement offices. A </w:t>
-      </w:r>
-      <w:r>
-        <w:t>detailed comparison is given in Chapter 2.</w:t>
+        <w:t xml:space="preserve">Existing platforms do not close this gap. TopJobs.lk, Sri Lanka’s largest job portal, is fundamentally a job board: it lets employers post vacancies and collect CVs, with grading and shortlisting tools for the employer side, but it performs no candidate-to-vacancy matching and has no university-facing reporting layer. International platforms built for exactly this problem — Handshake, Internshala — are not localised for the Sri Lankan market and are not integrated with local university placement offices. A detailed comparison is given in Chapter 2.</w:t>
       </w:r>
     </w:p>
     <w:p>
@@ -5360,10 +3118,7 @@
         <w:jc w:val="both"/>
       </w:pPr>
       <w:r>
-        <w:t>NexSkill is a three-sided platform with an administrative layer, described briefly here and in full in Chapter 4. Students build a skill profile (manually, or by uploading CV text for rule-based skill extraction), browse a ranked list of internships with a full score breakdown, apply in one click, and track every application through to a digital offer letter they can accept or decline in-app. Companies post internships, see an automatically ranked candidate list for each posting, and move candidates through</w:t>
-      </w:r>
-      <w:r>
-        <w:t xml:space="preserve"> Pending → Shortlisted → Offered → Accepted/Rejected without leaving the platform. Universities see aggregated placement statistics and skill-gap intelligence for their own enrolled students, and can export a CSV report. Administrators verify new company and university accounts, moderate postings, and see platform-wide analytics.</w:t>
+        <w:t xml:space="preserve">NexSkill is a three-sided platform with an administrative layer, described briefly here and in full in Chapter 4. Students build a skill profile (manually, or by uploading CV text for rule-based skill extraction), browse a ranked list of internships with a full score breakdown, apply in one click, and track every application through to a digital offer letter they can accept or decline in-app. Companies post internships, see an automatically ranked candidate list for each posting, and move candidates through Pending → Shortlisted → Offered → Accepted/Rejected without leaving the platform. Universities see aggregated placement statistics and skill-gap intelligence for their own enrolled students, and can export a CSV report. Administrators verify new company and university accounts, moderate postings, and see platform-wide analytics.</w:t>
       </w:r>
     </w:p>
     <w:p>
@@ -5391,8 +3146,6 @@
       </w:pPr>
       <w:r>
         <w:t xml:space="preserve">Chapter 2 surveys existing platforms and academic literature on skill-based matching and states this project’s novelty relative to them. Chapter 3 justifies the specific techniques and technologies adopted. Chapter 4 describes the approach from the perspective of users, inputs, outputs, and process. Chapter 5 presents the system architecture, data flow, use cases, and functional/non-functional requirements. Chapter </w:t>
-      </w:r>
-      <w:r>
         <w:lastRenderedPageBreak/>
         <w:t>6 covers the implementation module by module, with real screenshots. Chapter 7 presents the testing strategy and results. Chapter 8 presents the algorithm-optimisation experiment and its findings. Chapter 9 concludes, reviews each objective, and states limitations and further work.</w:t>
       </w:r>
@@ -5495,13 +3248,7 @@
         <w:jc w:val="both"/>
       </w:pPr>
       <w:r>
-        <w:t xml:space="preserve">TopJobs.lk. </w:t>
-      </w:r>
-      <w:r>
-        <w:t>Sri Lanka's largest local job portal, operating since 2012. It gives employers a full e-recruitment SaaS toolkit — CV upload, automated vacancy posting, applicant grading and shortlisting, interview scheduling — and gives jobseekers a searchable vacancy databank with one-click applications. Its limitation for this project's purpose is structural: it is a general-purpose job board across all industries and seniority levels, not a skill-based matching system. There is no automatic candidate ranking, no per-ca</w:t>
-      </w:r>
-      <w:r>
-        <w:t>ndidate score breakdown, and no university-facing reporting layer.</w:t>
+        <w:t xml:space="preserve">TopJobs.lk. Sri Lanka's largest local job portal, operating since 2012. It gives employers a full e-recruitment SaaS toolkit — CV upload, automated vacancy posting, applicant grading and shortlisting, interview scheduling — and gives jobseekers a searchable vacancy databank with one-click applications. Its limitation for this project's purpose is structural: it is a general-purpose job board across all industries and seniority levels, not a skill-based matching system. There is no automatic candidate ranking, no per-candidate score breakdown, and no university-facing reporting layer.</w:t>
       </w:r>
     </w:p>
     <w:p>
@@ -5519,10 +3266,7 @@
         <w:jc w:val="both"/>
       </w:pPr>
       <w:r>
-        <w:t xml:space="preserve">Handshake. </w:t>
-      </w:r>
-      <w:r>
-        <w:t>A US-centric early-career platform integrated with over 800 universities and 200,000 employers globally. Its strongest feature relative to NexSkill's ambitions is exactly the university-integration layer NexSkill also targets — universities post roles, track student engagement, and use the platform in advising workflows. However, Handshake's matching is closed-source and not transparent to the student (no visible score breakdown), and the platform has no presence or localisation for the Sri Lankan market.</w:t>
+        <w:t xml:space="preserve">Handshake. A US-centric early-career platform integrated with over 800 universities and 200,000 employers globally. Its strongest feature relative to NexSkill's ambitions is exactly the university-integration layer NexSkill also targets — universities post roles, track student engagement, and use the platform in advising workflows. However, Handshake's matching is closed-source and not transparent to the student (no visible score breakdown), and the platform has no presence or localisation for the Sri Lankan market.</w:t>
       </w:r>
     </w:p>
     <w:p>
@@ -5532,8 +3276,6 @@
       </w:pPr>
       <w:r>
         <w:t xml:space="preserve">Internshala. India's largest internship platform (21M+ candidates), with strong skill- and location-based filtering and bundled skill-training courses. Its filtering is closer to search than matching — students filter manually rather than receiving a ranked, scored </w:t>
-      </w:r>
-      <w:r>
         <w:lastRenderedPageBreak/>
         <w:t>list — and, like Handshake, it has no Sri Lankan presence or local university integration.</w:t>
       </w:r>
@@ -5562,13 +3304,7 @@
         <w:jc w:val="both"/>
       </w:pPr>
       <w:r>
-        <w:t>The matching technique at the core of NexSkill — TF-IDF vectorisation followed by cosine similarity — is a long-established and still actively used approach in job-matching research. Manning and Schütze’s foundational text on statistical NLP [4] defines the TF-IDF weighting scheme NexSkill’s own implementation (Chapter 6) follows directly. More recent work confirms the approach is still competitive: Winardi et al. [8]</w:t>
-      </w:r>
-      <w:r>
-        <w:t xml:space="preserve"> build a job-recommendation system using scikit-learn TF-IDF and cosine similarity over job descriptions; Singh and Garg [6] combine TF-IDF, cosine similarity, and named-entity recognition specifically for resume ranking; and Ajjam and Al-Raweshidy [1]</w:t>
-      </w:r>
-      <w:r>
-        <w:t xml:space="preserve"> present a 2026 real-time recruitment system that layers TF-IDF vectorisation, cosine-similarity scoring, and domain-specific keyword weighting to interpret conceptual relevance between resumes and job descriptions — the same three-part structure (keyword layer, statistical-similarity layer, domain weighting) NexSkill’s matching engine uses.</w:t>
+        <w:t xml:space="preserve">The matching technique at the core of NexSkill — TF-IDF vectorisation followed by cosine similarity — is a long-established and still actively used approach in job-matching research. Manning and Schütze’s foundational text on statistical NLP [4] defines the TF-IDF weighting scheme NexSkill’s own implementation (Chapter 6) follows directly. More recent work confirms the approach is still competitive: Winardi et al. [8] build a job-recommendation system using scikit-learn TF-IDF and cosine similarity over job descriptions; Singh and Garg [6] combine TF-IDF, cosine similarity, and named-entity recognition specifically for resume ranking; and Ajjam and Al-Raweshidy [1] present a 2026 real-time recruitment system that layers TF-IDF vectorisation, cosine-similarity scoring, and domain-specific keyword weighting to interpret conceptual relevance between resumes and job descriptions — the same three-part structure (keyword layer, statistical-similarity layer, domain weighting) NexSkill’s matching engine uses.</w:t>
       </w:r>
     </w:p>
     <w:p>
@@ -5577,10 +3313,7 @@
         <w:jc w:val="both"/>
       </w:pPr>
       <w:r>
-        <w:t>On the resume-parsing side, the proposal’s originally intended technique — a spaCy Named Entity Recognition model fine-tuned to extract skills from unstructured CV text — is well precedented: Channabasamma et al. [3]</w:t>
-      </w:r>
-      <w:r>
-        <w:t xml:space="preserve"> describe exactly this, a contextual spaCy-based information-extraction model for resume analytics. NexSkill’s current implementation uses rule-based dictionary matching instead of a trained NER model; Chapter 3 explains why, and this is reported honestly as a scoped-down substitution rather than claimed as equivalent.</w:t>
+        <w:t xml:space="preserve">On the resume-parsing side, the proposal’s originally intended technique — a spaCy Named Entity Recognition model fine-tuned to extract skills from unstructured CV text — is well precedented: Channabasamma et al. [3] describe exactly this, a contextual spaCy-based information-extraction model for resume analytics. NexSkill’s current implementation uses rule-based dictionary matching instead of a trained NER model; Chapter 3 explains why, and this is reported honestly as a scoped-down substitution rather than claimed as equivalent.</w:t>
       </w:r>
     </w:p>
     <w:p>
@@ -6757,10 +4490,7 @@
         <w:jc w:val="both"/>
       </w:pPr>
       <w:r>
-        <w:t>Skill overlap itself, the largest-weighted factor (45%), is computed in three tiers, escalating from cheapest/most confident to more speculative: (1) exact case-insensitive string match; (2) a curated table of eight semantically-equivalent skill groups (e.g. Node.js/Express.js, React/Next.js) reviewed by the team; (3) a TF-IDF cosine-similarity layer, following the weighting scheme in Manning and Schütze [4] and the job-matching applications of it in [1], [6], and [8]</w:t>
-      </w:r>
-      <w:r>
-        <w:t>. This third tier is computed over a hand-built corpus of 70 skills, each represented as a short set of descriptive tags (e.g. React → frontend, javascript, ui, component, spa, library), and catches skill pairs the curated table does not cover — Vue against a React requirement, or Docker against a Kubernetes requirement, both score a real, computed 55% similarity rather than 0%, verified directly in scripts/tfidf-check.mjs and again against live application data in Chapter 8.</w:t>
+        <w:t>Skill overlap itself, the largest-weighted factor (45%), is computed in three tiers, escalating from cheapest/most confident to more speculative: (1) exact case-insensitive string match; (2) a curated table of eight semantically-equivalent skill groups (e.g. Node.js/Express.js, React/Next.js) reviewed by the team; (3) a TF-IDF cosine-similarity layer, following the weighting scheme in Manning and Schütze [4] and the job-matching applications of it in [1], [6], and [8]. This third tier is computed over a hand-built corpus of 70 skills, each represented as a short set of descriptive tags (e.g. React → frontend, javascript, ui, component, spa, library), and catches skill pairs the curated table does not cover — Vue against a React requirement, or Docker against a Kubernetes requirement, both score a real, computed 55% similarity rather than 0%, verified directly in scripts/tfidf-check.mjs and again against live application data in Chapter 8.</w:t>
       </w:r>
     </w:p>
     <w:p>
@@ -6787,17 +4517,9 @@
         <w:jc w:val="both"/>
       </w:pPr>
       <w:r>
-        <w:t>The proposal specified a spaCy Named Entity Recognition model fine-tuned on technology job descriptions for CV skill extraction, following the approach demonstrated by Channabasamma et al. [3]</w:t>
-      </w:r>
-      <w:r>
-        <w:t>. The current implementation uses rule-</w:t>
-      </w:r>
-      <w:r>
+        <w:t>The proposal specified a spaCy Named Entity Recognition model fine-tuned on technology job descriptions for CV skill extraction, following the approach demonstrated by Channabasamma et al. [3]. The current implementation uses rule-</w:t>
         <w:lastRenderedPageBreak/>
-        <w:t xml:space="preserve">based dictionary matching instead: uploaded CV text is scanned against a 70-entry skill dictionary (the same dictionary the TF-IDF corpus in §3.2 is built over), and any exact substring match is extracted as a confirmed skill candidate for the student to accept, edit, or supplement. This is reported honestly rather than described as equivalent to a fine-tuned NER model: a trained model would generalise to skill phrasings never seen before and to skills outside a fixed </w:t>
-      </w:r>
-      <w:r>
-        <w:t>dictionary, which rule-based matching cannot do. Fine-tuning a real spaCy NER model requires labelled training data and GPU time neither available nor justified at this prototype’s scope, and is named explicitly as further work in §9.4.</w:t>
+        <w:t xml:space="preserve">based dictionary matching instead: uploaded CV text is scanned against a 70-entry skill dictionary (the same dictionary the TF-IDF corpus in §3.2 is built over), and any exact substring match is extracted as a confirmed skill candidate for the student to accept, edit, or supplement. This is reported honestly rather than described as equivalent to a fine-tuned NER model: a trained model would generalise to skill phrasings never seen before and to skills outside a fixed dictionary, which rule-based matching cannot do. Fine-tuning a real spaCy NER model requires labelled training data and GPU time neither available nor justified at this prototype’s scope, and is named explicitly as further work in §9.4.</w:t>
       </w:r>
     </w:p>
     <w:p>
@@ -7542,17 +5264,9 @@
         <w:jc w:val="both"/>
       </w:pPr>
       <w:r>
-        <w:t>The backend is Supabase [7]</w:t>
-      </w:r>
-      <w:r>
-        <w:t xml:space="preserve"> — managed PostgreSQL 17 with built-in Auth and a PostgREST API layer, replacing the project’s earlier local-JSON-file prototype entirely (migration covered in Chapter 6). Supabase was chosen, matching the original proposal, because it gives Row-Level Security, authentication, and a realtime-capable Postgres database without operating a separate backend server. The proposal additionally </w:t>
-      </w:r>
-      <w:r>
+        <w:t xml:space="preserve">The backend is Supabase [7] — managed PostgreSQL 17 with built-in Auth and a PostgREST API layer, replacing the project’s earlier local-JSON-file prototype entirely (migration covered in Chapter 6). Supabase was chosen, matching the original proposal, because it gives Row-Level Security, authentication, and a realtime-capable Postgres database without operating a separate backend server. The proposal additionally </w:t>
         <w:lastRenderedPageBreak/>
-        <w:t>specified Firebase Cloud Messaging for push notifications; the shipped system deliberately does not integrate Firebase — n</w:t>
-      </w:r>
-      <w:r>
-        <w:t>otifications are in-app only (a `notifications` table polled by the client). This is reported honestly as a descoped item rather than claimed as implemented, and is named in §9.3/§9.4 with a concrete integration path.</w:t>
+        <w:t>specified Firebase Cloud Messaging for push notifications; the shipped system deliberately does not integrate Firebase — notifications are in-app only (a `notifications` table polled by the client). This is reported honestly as a descoped item rather than claimed as implemented, and is named in §9.3/§9.4 with a concrete integration path.</w:t>
       </w:r>
     </w:p>
     <w:p>
@@ -7899,10 +5613,7 @@
         <w:jc w:val="both"/>
       </w:pPr>
       <w:r>
-        <w:t xml:space="preserve">A student registers, which (via a database trigger, §5.2) creates their profile row and links them to their university by name if a matching verified university exists. They complete their profile, optionally upload CV text for skill extraction, and view a ranked internship list computed live by the matching engine (Chapter 5). Applying creates an application row with the match score and breakdown frozen at application time. A company reviews the same ranking from its side — every registered student ranked </w:t>
-      </w:r>
-      <w:r>
-        <w:t>against its posting, not just applicants — shortlists or rejects, and sends a digital offer to a shortlisted candidate, which the student accepts or declines in-app. Every status change (shortlisted, offered, accepted, rejected) triggers an in-app notification to the other party. A university sees aggregated outcomes only for the students linked to it at registration; an admin sees and can act on everything, gated by Postgres Row-Level Security rather than by application code alone (§5.7, §7.3).</w:t>
+        <w:t xml:space="preserve">A student registers, which (via a database trigger, §5.2) creates their profile row and links them to their university by name if a matching verified university exists. They complete their profile, optionally upload CV text for skill extraction, and view a ranked internship list computed live by the matching engine (Chapter 5). Applying creates an application row with the match score and breakdown frozen at application time. A company reviews the same ranking from its side — every registered student ranked against its posting, not just applicants — shortlists or rejects, and sends a digital offer to a shortlisted candidate, which the student accepts or declines in-app. Every status change (shortlisted, offered, accepted, rejected) triggers an in-app notification to the other party. A university sees aggregated outcomes only for the students linked to it at registration; an admin sees and can act on everything, gated by Postgres Row-Level Security rather than by application code alone (§5.7, §7.3).</w:t>
       </w:r>
     </w:p>
     <w:p>
@@ -8030,10 +5741,7 @@
         <w:jc w:val="both"/>
       </w:pPr>
       <w:r>
-        <w:t>Figure 5.1 shows the three-layer architecture: a React 19 client layer (one portal per role), a Next.js 16 server layer (route handlers, the matching engine, and the skill-extraction/TF-IDF module), and Supabase (Auth, Postgres with Row-Level Security on every table, and a database trigger that provisions role-specific rows on signup). The server layer never holds a privileged database credential at runtime — every query is issued with the visitor’s own session, and Postgres itself, not application code, is</w:t>
-      </w:r>
-      <w:r>
-        <w:t xml:space="preserve"> the final authority on what a query is allowed to touch.</w:t>
+        <w:t xml:space="preserve">Figure 5.1 shows the three-layer architecture: a React 19 client layer (one portal per role), a Next.js 16 server layer (route handlers, the matching engine, and the skill-extraction/TF-IDF module), and Supabase (Auth, Postgres with Row-Level Security on every table, and a database trigger that provisions role-specific rows on signup). The server layer never holds a privileged database credential at runtime — every query is issued with the visitor’s own session, and Postgres itself, not application code, is the final authority on what a query is allowed to touch.</w:t>
       </w:r>
     </w:p>
     <w:p>
@@ -8127,8 +5835,6 @@
       </w:pPr>
       <w:r>
         <w:t xml:space="preserve">Figure 5.2 shows how a single match score is produced. A student profile and an internship posting are the two inputs; five factor computations run against them (skill overlap, GPA alignment, preference match, year-of-study fit, certification bonus), each </w:t>
-      </w:r>
-      <w:r>
         <w:lastRenderedPageBreak/>
         <w:t>independently weighted; skill overlap itself expands into the three-tier comparison described in §3.2, with the TF-IDF layer shown as an inset. The five weighted factors sum to the 0–100 match score and its breakdown, which two different callers then sort: rankStudentsForPosting() for the company candidate view, and rankPostingsForStudent() for the student matches view.</w:t>
       </w:r>
@@ -9461,13 +7167,8 @@
       </w:pPr>
       <w:r>
         <w:t xml:space="preserve">The data model is 9 Postgres tables, each with Row-Level Security enabled: users, student_profiles, company_profiles, university_profiles, cv_uploads, </w:t>
-      </w:r>
-      <w:r>
         <w:lastRenderedPageBreak/>
-        <w:t>internship_postings, applications, offer_letters, and notifications. A users row is created only by a database trigger (handle_new_user(), fired AFTER INSERT ON auth.users) that also creates the matching role-specific profile row, links a new student to their university by name if a verified match exists, and inserts an admin-queue notification for new company/university accounts — this logic lives in the database, not in application code, so it runs identically regardless of which code path creates the aut</w:t>
-      </w:r>
-      <w:r>
-        <w:t>h user (the app’s own registration route, or the admin-only seed script).</w:t>
+        <w:t>internship_postings, applications, offer_letters, and notifications. A users row is created only by a database trigger (handle_new_user(), fired AFTER INSERT ON auth.users) that also creates the matching role-specific profile row, links a new student to their university by name if a verified match exists, and inserts an admin-queue notification for new company/university accounts — this logic lives in the database, not in application code, so it runs identically regardless of which code path creates the auth user (the app’s own registration route, or the admin-only seed script).</w:t>
       </w:r>
     </w:p>
     <w:p>
@@ -9629,10 +7330,7 @@
         <w:jc w:val="both"/>
       </w:pPr>
       <w:r>
-        <w:t>One implementation note worth recording: the project was upgraded from Next.js 14.2.5 to 16.3.8 (and React 18 to 19) partway through development, specifically to close a set of disclosed Next.js CVEs — including an unauthenticated remote-code-execution vulnerability on Windows-hosted servers — before the system went live. The upgrade required migrating every use of Next’s cookies() and dynamic-route params from their old synchronous form to the new Promise-based form; every route handler using a dynamic [id</w:t>
-      </w:r>
-      <w:r>
-        <w:t>] segment was affected and is now consistently async.</w:t>
+        <w:t>One implementation note worth recording: the project was upgraded from Next.js 14.2.5 to 16.3.8 (and React 18 to 19) partway through development, specifically to close a set of disclosed Next.js CVEs — including an unauthenticated remote-code-execution vulnerability on Windows-hosted servers — before the system went live. The upgrade required migrating every use of Next’s cookies() and dynamic-route params from their old synchronous form to the new Promise-based form; every route handler using a dynamic [id] segment was affected and is now consistently async.</w:t>
       </w:r>
     </w:p>
     <w:p>
@@ -10257,66 +7955,17 @@
           <w:szCs w:val="18"/>
         </w:rPr>
         <w:t>const weighted =</w:t>
-      </w:r>
-      <w:r>
-        <w:rPr>
-          <w:rFonts w:ascii="Consolas" w:eastAsia="Consolas" w:hAnsi="Consolas" w:cs="Consolas"/>
-          <w:sz w:val="18"/>
-          <w:szCs w:val="18"/>
-        </w:rPr>
         <w:br/>
         <w:t xml:space="preserve">  skillOverlap * weights.skillOverlap +</w:t>
-      </w:r>
-      <w:r>
-        <w:rPr>
-          <w:rFonts w:ascii="Consolas" w:eastAsia="Consolas" w:hAnsi="Consolas" w:cs="Consolas"/>
-          <w:sz w:val="18"/>
-          <w:szCs w:val="18"/>
-        </w:rPr>
         <w:br/>
         <w:t xml:space="preserve">  gpa * weights.gpa +</w:t>
-      </w:r>
-      <w:r>
-        <w:rPr>
-          <w:rFonts w:ascii="Consolas" w:eastAsia="Consolas" w:hAnsi="Consolas" w:cs="Consolas"/>
-          <w:sz w:val="18"/>
-          <w:szCs w:val="18"/>
-        </w:rPr>
         <w:br/>
         <w:t xml:space="preserve">  preferences * weights.preferences +</w:t>
-      </w:r>
-      <w:r>
-        <w:rPr>
-          <w:rFonts w:ascii="Consolas" w:eastAsia="Consolas" w:hAnsi="Consolas" w:cs="Consolas"/>
-          <w:sz w:val="18"/>
-          <w:szCs w:val="18"/>
-        </w:rPr>
         <w:br/>
         <w:t xml:space="preserve">  yearOfStudy * weights.yearOfStudy +</w:t>
-      </w:r>
-      <w:r>
-        <w:rPr>
-          <w:rFonts w:ascii="Consolas" w:eastAsia="Consolas" w:hAnsi="Consolas" w:cs="Consolas"/>
-          <w:sz w:val="18"/>
-          <w:szCs w:val="18"/>
-        </w:rPr>
         <w:br/>
         <w:t xml:space="preserve">  certifications * weights.certifications;</w:t>
-      </w:r>
-      <w:r>
-        <w:rPr>
-          <w:rFonts w:ascii="Consolas" w:eastAsia="Consolas" w:hAnsi="Consolas" w:cs="Consolas"/>
-          <w:sz w:val="18"/>
-          <w:szCs w:val="18"/>
-        </w:rPr>
         <w:br/>
-      </w:r>
-      <w:r>
-        <w:rPr>
-          <w:rFonts w:ascii="Consolas" w:eastAsia="Consolas" w:hAnsi="Consolas" w:cs="Consolas"/>
-          <w:sz w:val="18"/>
-          <w:szCs w:val="18"/>
-        </w:rPr>
         <w:t>return { matchScore: Math.round(weighted * 100), breakdown: { ... } };</w:t>
       </w:r>
     </w:p>
@@ -10374,58 +8023,16 @@
           <w:szCs w:val="18"/>
         </w:rPr>
         <w:t>idf.set(term, Math.log(N / df.get(term)));</w:t>
-      </w:r>
-      <w:r>
-        <w:rPr>
-          <w:rFonts w:ascii="Consolas" w:eastAsia="Consolas" w:hAnsi="Consolas" w:cs="Consolas"/>
-          <w:sz w:val="18"/>
-          <w:szCs w:val="18"/>
-        </w:rPr>
         <w:br/>
         <w:t>...</w:t>
-      </w:r>
-      <w:r>
-        <w:rPr>
-          <w:rFonts w:ascii="Consolas" w:eastAsia="Consolas" w:hAnsi="Consolas" w:cs="Consolas"/>
-          <w:sz w:val="18"/>
-          <w:szCs w:val="18"/>
-        </w:rPr>
         <w:br/>
         <w:t>vector.set(term, count * (idf.get(term) || 0));</w:t>
-      </w:r>
-      <w:r>
-        <w:rPr>
-          <w:rFonts w:ascii="Consolas" w:eastAsia="Consolas" w:hAnsi="Consolas" w:cs="Consolas"/>
-          <w:sz w:val="18"/>
-          <w:szCs w:val="18"/>
-        </w:rPr>
         <w:br/>
         <w:t>...</w:t>
-      </w:r>
-      <w:r>
-        <w:rPr>
-          <w:rFonts w:ascii="Consolas" w:eastAsia="Consolas" w:hAnsi="Consolas" w:cs="Consolas"/>
-          <w:sz w:val="18"/>
-          <w:szCs w:val="18"/>
-        </w:rPr>
         <w:br/>
         <w:t>export function cosineSimilarity(vecA, vecB) {</w:t>
-      </w:r>
-      <w:r>
-        <w:rPr>
-          <w:rFonts w:ascii="Consolas" w:eastAsia="Consolas" w:hAnsi="Consolas" w:cs="Consolas"/>
-          <w:sz w:val="18"/>
-          <w:szCs w:val="18"/>
-        </w:rPr>
         <w:br/>
         <w:t xml:space="preserve">  // dot(A,B) / (||A|| * ||B||), computed over the shared-term sparse vectors</w:t>
-      </w:r>
-      <w:r>
-        <w:rPr>
-          <w:rFonts w:ascii="Consolas" w:eastAsia="Consolas" w:hAnsi="Consolas" w:cs="Consolas"/>
-          <w:sz w:val="18"/>
-          <w:szCs w:val="18"/>
-        </w:rPr>
         <w:br/>
         <w:t>}</w:t>
       </w:r>
@@ -10437,8 +8044,6 @@
       </w:pPr>
       <w:r>
         <w:t xml:space="preserve">lib/skills.js builds the 70-skill corpus once at module load (so term frequencies are not recomputed per match) and blends the result into the three-tier skillSetSimilarity() function: an exact match scores 1.0, a curated SEMANTIC_GROUPS match scores 0.75, and — only when neither of those fires — a TF-IDF cosine similarity at or above </w:t>
-      </w:r>
-      <w:r>
         <w:lastRenderedPageBreak/>
         <w:t>a 0.2 relatedness threshold contributes up to 0.55 credit, deliberately capped below the curated tier since it is a statistical, uncurated signal.</w:t>
       </w:r>
@@ -10488,22 +8093,8 @@
           <w:szCs w:val="18"/>
         </w:rPr>
         <w:t>create policy "company_profiles_owner" on public.company_profiles</w:t>
-      </w:r>
-      <w:r>
-        <w:rPr>
-          <w:rFonts w:ascii="Consolas" w:eastAsia="Consolas" w:hAnsi="Consolas" w:cs="Consolas"/>
-          <w:sz w:val="18"/>
-          <w:szCs w:val="18"/>
-        </w:rPr>
         <w:br/>
         <w:t xml:space="preserve">  for all using (user_id = auth.uid() or public.is_admin())</w:t>
-      </w:r>
-      <w:r>
-        <w:rPr>
-          <w:rFonts w:ascii="Consolas" w:eastAsia="Consolas" w:hAnsi="Consolas" w:cs="Consolas"/>
-          <w:sz w:val="18"/>
-          <w:szCs w:val="18"/>
-        </w:rPr>
         <w:br/>
         <w:t xml:space="preserve">  with check (user_id = auth.uid() or public.is_admin());</w:t>
       </w:r>
@@ -12869,8 +10460,6 @@
       </w:pPr>
       <w:r>
         <w:t xml:space="preserve">9 of 11 initial test cases passed outright. The two that failed (TC-05, TC-09) were not superficial bugs — TC-05 was a security-relevant Row-Level Security defect (a write </w:t>
-      </w:r>
-      <w:r>
         <w:lastRenderedPageBreak/>
         <w:t>that silently no-ops while still reporting success) and TC-09 was a framework-migration defect affecting every dynamic API route — so both are reported as genuine failures, root-caused, fixed, and re-tested rather than omitted or minimised. Counting the re-tests, 11 of 11 test cases pass as of this report (100%); counting only first attempts, 9 of 11 (82%).</w:t>
       </w:r>
@@ -14429,13 +12018,8 @@
       </w:pPr>
       <w:r>
         <w:t>The honest result is that precision, recall, and F1 did not move at the classification threshold used (60) — with only 40 pairs and a threshold-based binary decision, a 10-</w:t>
-      </w:r>
-      <w:r>
         <w:lastRenderedPageBreak/>
-        <w:t>point weight shift does not cross the decision boundary for any pair unless that pair was already very close to it, and none were in this dataset. This is reported as-is rather than adjusted to look more dramatic. What the experiment does establish, concretely: (1) GPA can safely carry less weight without harming match quality on this dataset, since removing its influence changed no classification outcome; (2) the mean match score dropped by 5.6 points, which is the expected, correctly-signed consequence of</w:t>
-      </w:r>
-      <w:r>
-        <w:t xml:space="preserve"> reducing the weight of a factor (GPA) that scores highly for most eligible candidates in this dataset; (3) skill overlap and preference match remain, and should remain, the dominant factors.</w:t>
+        <w:t xml:space="preserve">point weight shift does not cross the decision boundary for any pair unless that pair was already very close to it, and none were in this dataset. This is reported as-is rather than adjusted to look more dramatic. What the experiment does establish, concretely: (1) GPA can safely carry less weight without harming match quality on this dataset, since removing its influence changed no classification outcome; (2) the mean match score dropped by 5.6 points, which is the expected, correctly-signed consequence of reducing the weight of a factor (GPA) that scores highly for most eligible candidates in this dataset; (3) skill overlap and preference match remain, and should remain, the dominant factors.</w:t>
       </w:r>
     </w:p>
     <w:p>
@@ -14444,10 +12028,7 @@
         <w:jc w:val="both"/>
       </w:pPr>
       <w:r>
-        <w:t>The two specific pairs the baseline misclassified are informative on their own: a Software-Engineering-track student (7 skills, GPA 3.6) scored 65% — above the 60 threshold — against the Product Design posting, a false positive driven by the TF-IDF layer awarding partial credit for HTML/CSS/React against Figma/UI-UX Design tag overlap (§8.4); and a Software-Engineering-track student with only 4 listed skills scored 57% — just below threshold — against their own domain’s posting, a false negative, since this</w:t>
-      </w:r>
-      <w:r>
-        <w:t xml:space="preserve"> student genuinely lacks several of the posting’s required skills. Neither is a bug: both are the matching engine behaving exactly as designed on a borderline case, which is itself evidence the score is sensitive enough to be near a reasonable decision boundary rather than trivially separating all cases.</w:t>
+        <w:t xml:space="preserve">The two specific pairs the baseline misclassified are informative on their own: a Software-Engineering-track student (7 skills, GPA 3.6) scored 65% — above the 60 threshold — against the Product Design posting, a false positive driven by the TF-IDF layer awarding partial credit for HTML/CSS/React against Figma/UI-UX Design tag overlap (§8.4); and a Software-Engineering-track student with only 4 listed skills scored 57% — just below threshold — against their own domain’s posting, a false negative, since this student genuinely lacks several of the posting’s required skills. Neither is a bug: both are the matching engine behaving exactly as designed on a borderline case, which is itself evidence the score is sensitive enough to be near a reasonable decision boundary rather than trivially separating all cases.</w:t>
       </w:r>
     </w:p>
     <w:p>
@@ -15092,10 +12673,7 @@
         <w:jc w:val="both"/>
       </w:pPr>
       <w:r>
-        <w:t>This is visible in live application data, not only in the isolated check above: Figure 6.3 shows Ashan Perera — a Software Engineering-track student whose skills are JavaScript, React, Node.js, SQL, Git, HTML, CSS — scoring 57% skill overlap against the Sysco LABS Product Design posting (required skills: Figma, UI/UX Design, HTML, CSS). Without the TF-IDF layer, only HTML and CSS would match exactly (2 of 4 required skills = 50% raw overlap); the observed 57% reflects the additional partial credit the TF-ID</w:t>
-      </w:r>
-      <w:r>
-        <w:t>F layer contributes for React’s tag overlap with UI/UX Design (both carry a "ui" tag in the skill corpus, §6.5), on top of the two exact matches, correctly reflecting that a front-end developer’s skill set is not equally irrelevant to a design role.</w:t>
+        <w:t>This is visible in live application data, not only in the isolated check above: Figure 6.3 shows Ashan Perera — a Software Engineering-track student whose skills are JavaScript, React, Node.js, SQL, Git, HTML, CSS — scoring 57% skill overlap against the Sysco LABS Product Design posting (required skills: Figma, UI/UX Design, HTML, CSS). Without the TF-IDF layer, only HTML and CSS would match exactly (2 of 4 required skills = 50% raw overlap); the observed 57% reflects the additional partial credit the TF-IDF layer contributes for React’s tag overlap with UI/UX Design (both carry a "ui" tag in the skill corpus, §6.5), on top of the two exact matches, correctly reflecting that a front-end developer’s skill set is not equally irrelevant to a design role.</w:t>
       </w:r>
     </w:p>
     <w:p>
@@ -15122,10 +12700,7 @@
         <w:jc w:val="both"/>
       </w:pPr>
       <w:r>
-        <w:t>Three findings from this evaluation are worth foregrounding. First, a transparent, weighted-sum matching algorithm reached 90% precision and 90% recall against an algorithm-independent ground truth on this dataset — a defensible result for a system whose primary requirement is explainability, not raw predictive accuracy. Second, the empirical weight-adjustment process this chapter documents is itself evidence against blindly trusting a proposed weighting: GPA was proposed at 20% and, on this dataset, contri</w:t>
-      </w:r>
-      <w:r>
-        <w:t>butes almost no discriminative value toward what a domain-and-skill-fit ground truth considers relevant. Third, testing surfaced a real defect (§7.3, TC-05) whose nature — a security policy that silently no-ops instead of failing loudly — is exactly the kind of problem dataset-only evaluation would never catch and only integration testing against the real database could; this is a direct argument for the integration-testing strategy chosen in Chapter 7 over evaluating the matching logic in isolation.</w:t>
+        <w:t>Three findings from this evaluation are worth foregrounding. First, a transparent, weighted-sum matching algorithm reached 90% precision and 90% recall against an algorithm-independent ground truth on this dataset — a defensible result for a system whose primary requirement is explainability, not raw predictive accuracy. Second, the empirical weight-adjustment process this chapter documents is itself evidence against blindly trusting a proposed weighting: GPA was proposed at 20% and, on this dataset, contributes almost no discriminative value toward what a domain-and-skill-fit ground truth considers relevant. Third, testing surfaced a real defect (§7.3, TC-05) whose nature — a security policy that silently no-ops instead of failing loudly — is exactly the kind of problem dataset-only evaluation would never catch and only integration testing against the real database could; this is a direct argument for the integration-testing strategy chosen in Chapter 7 over evaluating the matching logic in isolation.</w:t>
       </w:r>
     </w:p>
     <w:p>
@@ -15153,8 +12728,6 @@
       </w:pPr>
       <w:r>
         <w:t xml:space="preserve">The matching engine was evaluated against a 40-pair, algorithm-independent ground truth, achieving 90%/90%/90% precision/recall/F1 at baseline; a documented second weighting iteration, informed by real per-factor correlation data, confirmed GPA as a weak predictor on this dataset without harming classification accuracy. The TF-IDF layer’s contribution was verified directly in both isolated checks and live application </w:t>
-      </w:r>
-      <w:r>
         <w:lastRenderedPageBreak/>
         <w:t>screenshots. Chapter 9 concludes the report, reviews each objective, and states limitations and further work.</w:t>
       </w:r>
@@ -16060,10 +13633,7 @@
         <w:jc w:val="both"/>
       </w:pPr>
       <w:r>
-        <w:t>NexSkill set out to prove that a transparent, explainable matching algorithm could be a credible, evaluable alternative to an opaque machine-learning model for a Sri Lankan internship-matching platform. Five of six proposal objectives were fully achieved and one partially achieved; the matching engine reached 90% precision and recall against a genuine, algorithm-independent evaluation; a real security defect was found and fixed during testing rather than glossed over; and every gap between what was proposed</w:t>
-      </w:r>
-      <w:r>
-        <w:t xml:space="preserve"> and what shipped — the NLP approach, push notifications — is reported plainly above rather than implied to be complete. That honesty, and the real evidence behind every number in this report, is the standard the rest of the team’s work should be held to as the project continues.</w:t>
+        <w:t xml:space="preserve">NexSkill set out to prove that a transparent, explainable matching algorithm could be a credible, evaluable alternative to an opaque machine-learning model for a Sri Lankan internship-matching platform. Five of six proposal objectives were fully achieved and one partially achieved; the matching engine reached 90% precision and recall against a genuine, algorithm-independent evaluation; a real security defect was found and fixed during testing rather than glossed over; and every gap between what was proposed and what shipped — the NLP approach, push notifications — is reported plainly above rather than implied to be complete. That honesty, and the real evidence behind every number in this report, is the standard the rest of the team’s work should be held to as the project continues.</w:t>
       </w:r>
     </w:p>
     <w:p>
@@ -16217,7 +13787,7 @@
         <w:jc w:val="both"/>
       </w:pPr>
       <w:r>
-        <w:t>[To be completed by Shakkya — describe what you personally built/contributed to the project.]</w:t>
+        <w:t>[DRAFT — NEEDS YOUR CONFIRMATION BEFORE SUBMISSION: based on your role at proposal stage; replace with what you actually did for the final submission.] As Group Leader, I was responsible for overall project coordination: setting the initial system architecture direction, allocating modules across the team, tracking progress against the proposal timeline, and coordinating the final submission (report, user manual, presentation deck, and repository handover).</w:t>
       </w:r>
     </w:p>
     <w:p>
@@ -16238,7 +13808,7 @@
         <w:jc w:val="both"/>
       </w:pPr>
       <w:r>
-        <w:t>[To be completed]</w:t>
+        <w:t>[DRAFT — NEEDS YOUR CONFIRMATION BEFORE SUBMISSION: replace with your own reflection.] Coordinating a six-person team on a project that changed substantially from its original proposal taught me the importance of re-aligning scope and module ownership early once the technical approach shifts, rather than leaving responsibilities fixed to an outdated plan.</w:t>
       </w:r>
     </w:p>
     <w:p>
@@ -16259,7 +13829,7 @@
         <w:jc w:val="both"/>
       </w:pPr>
       <w:r>
-        <w:t>[To be completed]</w:t>
+        <w:t>[DRAFT — NEEDS YOUR CONFIRMATION BEFORE SUBMISSION: replace with a specific problem you personally solved.] [Describe a specific coordination or scheduling problem you ran into and how you resolved it — for example, keeping the team aligned after the architecture changed from the original Flask/Firebase proposal to an all-Supabase/Next.js stack.]</w:t>
       </w:r>
     </w:p>
     <w:p>
@@ -16284,7 +13854,7 @@
         <w:jc w:val="both"/>
       </w:pPr>
       <w:r>
-        <w:t>[To be completed by Malitha — describe what you personally built/contributed to the project.]</w:t>
+        <w:t>[DRAFT — NEEDS YOUR CONFIRMATION BEFORE SUBMISSION: replace with the specific pages/components you actually built.] I was assigned Frontend Development &amp; UI/UX: building responsive UI components and user flows across the platform using Next.js, React, and Tailwind CSS.</w:t>
       </w:r>
     </w:p>
     <w:p>
@@ -16305,7 +13875,7 @@
         <w:jc w:val="both"/>
       </w:pPr>
       <w:r>
-        <w:t>[To be completed]</w:t>
+        <w:t>[DRAFT — NEEDS YOUR CONFIRMATION BEFORE SUBMISSION: replace with your own reflection.] [Describe what you learned building the UI — e.g. reusing components across four different role-based portals, responsive design, or working with Tailwind CSS.]</w:t>
       </w:r>
     </w:p>
     <w:p>
@@ -16326,7 +13896,7 @@
         <w:jc w:val="both"/>
       </w:pPr>
       <w:r>
-        <w:t>[To be completed]</w:t>
+        <w:t>[DRAFT — NEEDS YOUR CONFIRMATION BEFORE SUBMISSION: replace with a specific problem you personally solved.] [Describe a specific UI/UX problem you ran into and how you fixed it.]</w:t>
       </w:r>
     </w:p>
     <w:p>
@@ -16351,13 +13921,7 @@
         <w:jc w:val="both"/>
       </w:pPr>
       <w:r>
-        <w:t>I led the platform's data layer and matching-algorithm work for this submission: migrating the prototype from a local JSON file to a Supabase PostgreSQL backend with Row-Level Security on every table and a signup-provisioning trigger; rewriting all 25 API routes and the authentication/session layer against the new backend; implementing the TF-IDF cosine-similarity layer described in Chapter 3 and Chapter 6 from first principles (corpus construction, IDF weighting, cosine similarity, and its blend into the e</w:t>
-      </w:r>
-      <w:r>
-        <w:t>xisting exact/curated matching tiers); designing and running the algorithm-optimisation experiment in Chapter 8; and finding, root-causing, and fixing the Row-Level Security defect documented in Chapter 7 (TC-05), where an admin write silently affected zero rows while the API still reported success. I also upgraded the project from Next.js 14 to 16 to close a set of disclosed CVEs, which required migrating every dynamic route handler to the framework's new asynchronous cookies()/params APIs (TC-09 in Chapte</w:t>
-      </w:r>
-      <w:r>
-        <w:t>r 7 is one of the regressions this surfaced and I fixed).</w:t>
+        <w:t>I led the platform's data layer and matching-algorithm work for this submission: migrating the prototype from a local JSON file to a Supabase PostgreSQL backend with Row-Level Security on every table and a signup-provisioning trigger; rewriting all 25 API routes and the authentication/session layer against the new backend; implementing the TF-IDF cosine-similarity layer described in Chapter 3 and Chapter 6 from first principles (corpus construction, IDF weighting, cosine similarity, and its blend into the existing exact/curated matching tiers); designing and running the algorithm-optimisation experiment in Chapter 8; and finding, root-causing, and fixing the Row-Level Security defect documented in Chapter 7 (TC-05), where an admin write silently affected zero rows while the API still reported success. I also upgraded the project from Next.js 14 to 16 to close a set of disclosed CVEs, which required migrating every dynamic route handler to the framework's new asynchronous cookies()/params APIs (TC-09 in Chapter 7 is one of the regressions this surfaced and I fixed).</w:t>
       </w:r>
     </w:p>
     <w:p>
@@ -16378,7 +13942,7 @@
         <w:jc w:val="both"/>
       </w:pPr>
       <w:r>
-        <w:t>[To be completed]</w:t>
+        <w:t>Working on NexSkill's data layer taught me how different real-world Postgres Row-Level Security is from reasoning about access control in application code: a policy's USING and WITH CHECK clauses have to be designed together, and getting it wrong can fail silently rather than loudly. Migrating the prototype off a local JSON file also meant thinking in terms of what a serverless host can and cannot persist, which is what made the Supabase migration a precondition for deployment rather than a nice-to-have. Building the TF-IDF cosine-similarity layer from first principles — corpus construction, IDF weighting, and blending it into the existing exact/curated matching tiers — gave me a much more concrete sense of how classical NLP techniques behave on a small, domain-specific corpus compared to just calling a library function.</w:t>
       </w:r>
     </w:p>
     <w:p>
@@ -16399,7 +13963,7 @@
         <w:jc w:val="both"/>
       </w:pPr>
       <w:r>
-        <w:t>[To be completed]</w:t>
+        <w:t>Two issues stood out. First, the RLS bug in TC-05: an admin action to verify a company account appeared to succeed in the UI but silently updated zero rows, because the policy's WITH CHECK clause was missing is_admin() even though USING had it. I diagnosed it by replaying the same request with curl against the live database, independent of the browser session, which confirmed the API itself — not a UI quirk — was the problem, then fixed the policy to require the same admin check on both clauses. Second, upgrading the project from Next.js 14 to 16 to close disclosed CVEs broke every dynamic route handler, since params and cookies() became Promises under the new async APIs (TC-09 was one of the regressions this surfaced); I fixed it by auditing every [id] route and adding await params consistently rather than patching handlers one at a time as they failed.</w:t>
       </w:r>
     </w:p>
     <w:p>
@@ -16424,7 +13988,7 @@
         <w:jc w:val="both"/>
       </w:pPr>
       <w:r>
-        <w:t>[To be completed by Chamika — describe what you personally built/contributed to the project.]</w:t>
+        <w:t>[DRAFT — NEEDS YOUR CONFIRMATION BEFORE SUBMISSION: replace with the specific features you actually implemented.] I was assigned the Company Portal and Digital Offer Letter workflow: the company dashboard, internship-posting flow, and offer-letter generation, built with Next.js and Supabase.</w:t>
       </w:r>
     </w:p>
     <w:p>
@@ -16445,7 +14009,7 @@
         <w:jc w:val="both"/>
       </w:pPr>
       <w:r>
-        <w:t>[To be completed]</w:t>
+        <w:t>[DRAFT — NEEDS YOUR CONFIRMATION BEFORE SUBMISSION: replace with your own reflection.] [Describe what you learned building the company-side workflow — e.g. designing the posting-to-offer pipeline, or generating PDFs client-side.]</w:t>
       </w:r>
     </w:p>
     <w:p>
@@ -16466,7 +14030,7 @@
         <w:jc w:val="both"/>
       </w:pPr>
       <w:r>
-        <w:t>[To be completed]</w:t>
+        <w:t>[DRAFT — NEEDS YOUR CONFIRMATION BEFORE SUBMISSION: replace with a specific problem you personally solved.] [Describe a specific problem you ran into on the company portal or offer-letter flow and how you fixed it.]</w:t>
       </w:r>
     </w:p>
     <w:p>
@@ -16491,7 +14055,7 @@
         <w:jc w:val="both"/>
       </w:pPr>
       <w:r>
-        <w:t>[To be completed by Tharusha — describe what you personally built/contributed to the project.]</w:t>
+        <w:t>[DRAFT — NEEDS YOUR CONFIRMATION BEFORE SUBMISSION: IMPORTANT — your originally planned module (a separate Flask/spaCy resume-parsing microservice) was NOT part of the final shipped architecture; the final app does CV keyword extraction inside the Next.js app itself (lib/skills.js), with no Flask service and no spaCy. Please describe what you actually built for the final submission instead of the original proposal — do not describe the Flask/spaCy design unless it was genuinely implemented elsewhere.] I was originally assigned the Resume Parser module at proposal stage.</w:t>
       </w:r>
     </w:p>
     <w:p>
@@ -16512,7 +14076,7 @@
         <w:jc w:val="both"/>
       </w:pPr>
       <w:r>
-        <w:t>[To be completed]</w:t>
+        <w:t>[DRAFT — NEEDS YOUR CONFIRMATION BEFORE SUBMISSION: replace with your own reflection on what you actually worked on.] [Describe what you learned.]</w:t>
       </w:r>
     </w:p>
     <w:p>
@@ -16533,7 +14097,7 @@
         <w:jc w:val="both"/>
       </w:pPr>
       <w:r>
-        <w:t>[To be completed]</w:t>
+        <w:t>[DRAFT — NEEDS YOUR CONFIRMATION BEFORE SUBMISSION: replace with a specific problem you personally solved.] [Describe a specific problem you ran into and how you fixed it.]</w:t>
       </w:r>
     </w:p>
     <w:p>
@@ -16558,7 +14122,7 @@
         <w:jc w:val="both"/>
       </w:pPr>
       <w:r>
-        <w:t>[To be completed by Chamoda — describe what you personally built/contributed to the project.]</w:t>
+        <w:t>[DRAFT — NEEDS YOUR CONFIRMATION BEFORE SUBMISSION: replace with the specific features you actually implemented.] I was assigned the University Dashboard and Admin Panel: placement analytics/reporting and system administration features, built with Next.js and Supabase.</w:t>
       </w:r>
     </w:p>
     <w:p>
@@ -16579,7 +14143,7 @@
         <w:jc w:val="both"/>
       </w:pPr>
       <w:r>
-        <w:t>[To be completed]</w:t>
+        <w:t>[DRAFT — NEEDS YOUR CONFIRMATION BEFORE SUBMISSION: replace with your own reflection.] [Describe what you learned building the analytics dashboard or admin panel.]</w:t>
       </w:r>
     </w:p>
     <w:p>
@@ -16600,7 +14164,7 @@
         <w:jc w:val="both"/>
       </w:pPr>
       <w:r>
-        <w:t>[To be completed]</w:t>
+        <w:t>[DRAFT — NEEDS YOUR CONFIRMATION BEFORE SUBMISSION: replace with a specific problem you personally solved.] [Describe a specific problem you ran into and how you fixed it.]</w:t>
       </w:r>
     </w:p>
     <w:sectPr>

</xml_diff>